<commit_message>
Use the updated proforma template without the consignee underline.
Co-authored-by: Cursor <cursoragent@cursor.com>
</commit_message>
<xml_diff>
--- a/src/assets/Template.docx
+++ b/src/assets/Template.docx
@@ -1,6 +1,6 @@
 
 <file path=word/document.xml><?xml version="1.0" encoding="utf-8"?>
-<w:document xmlns:wpc="http://schemas.microsoft.com/office/word/2010/wordprocessingCanvas" xmlns:cx="http://schemas.microsoft.com/office/drawing/2014/chartex" xmlns:cx1="http://schemas.microsoft.com/office/drawing/2015/9/8/chartex" xmlns:cx2="http://schemas.microsoft.com/office/drawing/2015/10/21/chartex" xmlns:cx3="http://schemas.microsoft.com/office/drawing/2016/5/9/chartex" xmlns:cx4="http://schemas.microsoft.com/office/drawing/2016/5/10/chartex" xmlns:cx5="http://schemas.microsoft.com/office/drawing/2016/5/11/chartex" xmlns:cx6="http://schemas.microsoft.com/office/drawing/2016/5/12/chartex" xmlns:cx7="http://schemas.microsoft.com/office/drawing/2016/5/13/chartex" xmlns:cx8="http://schemas.microsoft.com/office/drawing/2016/5/14/chartex" xmlns:mc="http://schemas.openxmlformats.org/markup-compatibility/2006" xmlns:aink="http://schemas.microsoft.com/office/drawing/2016/ink" xmlns:am3d="http://schemas.microsoft.com/office/drawing/2017/model3d" xmlns:o="urn:schemas-microsoft-com:office:office" xmlns:oel="http://schemas.microsoft.com/office/2019/extlst" xmlns:r="http://schemas.openxmlformats.org/officeDocument/2006/relationships" xmlns:m="http://schemas.openxmlformats.org/officeDocument/2006/math" xmlns:v="urn:schemas-microsoft-com:vml" xmlns:wp14="http://schemas.microsoft.com/office/word/2010/wordprocessingDrawing" xmlns:wp="http://schemas.openxmlformats.org/drawingml/2006/wordprocessingDrawing" xmlns:w10="urn:schemas-microsoft-com:office:word" xmlns:w="http://schemas.openxmlformats.org/wordprocessingml/2006/main" xmlns:w14="http://schemas.microsoft.com/office/word/2010/wordml" xmlns:w15="http://schemas.microsoft.com/office/word/2012/wordml" xmlns:w16cex="http://schemas.microsoft.com/office/word/2018/wordml/cex" xmlns:w16cid="http://schemas.microsoft.com/office/word/2016/wordml/cid" xmlns:w16="http://schemas.microsoft.com/office/word/2018/wordml" xmlns:w16du="http://schemas.microsoft.com/office/word/2023/wordml/word16du" xmlns:w16sdtdh="http://schemas.microsoft.com/office/word/2020/wordml/sdtdatahash" xmlns:w16se="http://schemas.microsoft.com/office/word/2015/wordml/symex" xmlns:wpg="http://schemas.microsoft.com/office/word/2010/wordprocessingGroup" xmlns:wpi="http://schemas.microsoft.com/office/word/2010/wordprocessingInk" xmlns:wne="http://schemas.microsoft.com/office/word/2006/wordml" xmlns:wps="http://schemas.microsoft.com/office/word/2010/wordprocessingShape" mc:Ignorable="w14 w15 w16se w16cid w16 w16cex w16sdtdh w16du wp14">
+<w:document xmlns:wpc="http://schemas.microsoft.com/office/word/2010/wordprocessingCanvas" xmlns:cx="http://schemas.microsoft.com/office/drawing/2014/chartex" xmlns:cx1="http://schemas.microsoft.com/office/drawing/2015/9/8/chartex" xmlns:cx2="http://schemas.microsoft.com/office/drawing/2015/10/21/chartex" xmlns:cx3="http://schemas.microsoft.com/office/drawing/2016/5/9/chartex" xmlns:cx4="http://schemas.microsoft.com/office/drawing/2016/5/10/chartex" xmlns:cx5="http://schemas.microsoft.com/office/drawing/2016/5/11/chartex" xmlns:cx6="http://schemas.microsoft.com/office/drawing/2016/5/12/chartex" xmlns:cx7="http://schemas.microsoft.com/office/drawing/2016/5/13/chartex" xmlns:cx8="http://schemas.microsoft.com/office/drawing/2016/5/14/chartex" xmlns:mc="http://schemas.openxmlformats.org/markup-compatibility/2006" xmlns:aink="http://schemas.microsoft.com/office/drawing/2016/ink" xmlns:am3d="http://schemas.microsoft.com/office/drawing/2017/model3d" xmlns:o="urn:schemas-microsoft-com:office:office" xmlns:oel="http://schemas.microsoft.com/office/2019/extlst" xmlns:r="http://schemas.openxmlformats.org/officeDocument/2006/relationships" xmlns:m="http://schemas.openxmlformats.org/officeDocument/2006/math" xmlns:v="urn:schemas-microsoft-com:vml" xmlns:wp14="http://schemas.microsoft.com/office/word/2010/wordprocessingDrawing" xmlns:wp="http://schemas.openxmlformats.org/drawingml/2006/wordprocessingDrawing" xmlns:w10="urn:schemas-microsoft-com:office:word" xmlns:w="http://schemas.openxmlformats.org/wordprocessingml/2006/main" xmlns:w14="http://schemas.microsoft.com/office/word/2010/wordml" xmlns:w15="http://schemas.microsoft.com/office/word/2012/wordml" xmlns:w16cex="http://schemas.microsoft.com/office/word/2018/wordml/cex" xmlns:w16cid="http://schemas.microsoft.com/office/word/2016/wordml/cid" xmlns:w16="http://schemas.microsoft.com/office/word/2018/wordml" xmlns:w16du="http://schemas.microsoft.com/office/word/2023/wordml/word16du" xmlns:w16sdtdh="http://schemas.microsoft.com/office/word/2020/wordml/sdtdatahash" xmlns:w16sdtfl="http://schemas.microsoft.com/office/word/2024/wordml/sdtformatlock" xmlns:w16se="http://schemas.microsoft.com/office/word/2015/wordml/symex" xmlns:wpg="http://schemas.microsoft.com/office/word/2010/wordprocessingGroup" xmlns:wpi="http://schemas.microsoft.com/office/word/2010/wordprocessingInk" xmlns:wne="http://schemas.microsoft.com/office/word/2006/wordml" xmlns:wps="http://schemas.microsoft.com/office/word/2010/wordprocessingShape" mc:Ignorable="w14 w15 w16se w16cid w16 w16cex w16sdtdh w16sdtfl w16du wp14">
   <w:body>
     <w:p>
       <w:pPr>
@@ -99,7 +99,7 @@
     </w:p>
     <w:tbl>
       <w:tblPr>
-        <w:tblStyle w:val="TableGrid"/>
+        <w:tblStyle w:val="Tablaconcuadrcula"/>
         <w:tblW w:w="0" w:type="auto"/>
         <w:tblLook w:val="04A0" w:firstRow="1" w:lastRow="0" w:firstColumn="1" w:lastColumn="0" w:noHBand="0" w:noVBand="1"/>
       </w:tblPr>
@@ -831,7 +831,6 @@
                 <w:rFonts w:ascii="Arial" w:hAnsi="Arial" w:cs="Arial"/>
                 <w:sz w:val="18"/>
                 <w:szCs w:val="18"/>
-                <w:u w:val="single"/>
                 <w:lang w:val="en-US"/>
               </w:rPr>
             </w:pPr>
@@ -2047,7 +2046,7 @@
 </file>
 
 <file path=word/styles.xml><?xml version="1.0" encoding="utf-8"?>
-<w:styles xmlns:mc="http://schemas.openxmlformats.org/markup-compatibility/2006" xmlns:r="http://schemas.openxmlformats.org/officeDocument/2006/relationships" xmlns:w="http://schemas.openxmlformats.org/wordprocessingml/2006/main" xmlns:w14="http://schemas.microsoft.com/office/word/2010/wordml" xmlns:w15="http://schemas.microsoft.com/office/word/2012/wordml" xmlns:w16cex="http://schemas.microsoft.com/office/word/2018/wordml/cex" xmlns:w16cid="http://schemas.microsoft.com/office/word/2016/wordml/cid" xmlns:w16="http://schemas.microsoft.com/office/word/2018/wordml" xmlns:w16du="http://schemas.microsoft.com/office/word/2023/wordml/word16du" xmlns:w16sdtdh="http://schemas.microsoft.com/office/word/2020/wordml/sdtdatahash" xmlns:w16se="http://schemas.microsoft.com/office/word/2015/wordml/symex" mc:Ignorable="w14 w15 w16se w16cid w16 w16cex w16sdtdh w16du">
+<w:styles xmlns:mc="http://schemas.openxmlformats.org/markup-compatibility/2006" xmlns:r="http://schemas.openxmlformats.org/officeDocument/2006/relationships" xmlns:w="http://schemas.openxmlformats.org/wordprocessingml/2006/main" xmlns:w14="http://schemas.microsoft.com/office/word/2010/wordml" xmlns:w15="http://schemas.microsoft.com/office/word/2012/wordml" xmlns:w16cex="http://schemas.microsoft.com/office/word/2018/wordml/cex" xmlns:w16cid="http://schemas.microsoft.com/office/word/2016/wordml/cid" xmlns:w16="http://schemas.microsoft.com/office/word/2018/wordml" xmlns:w16du="http://schemas.microsoft.com/office/word/2023/wordml/word16du" xmlns:w16sdtdh="http://schemas.microsoft.com/office/word/2020/wordml/sdtdatahash" xmlns:w16sdtfl="http://schemas.microsoft.com/office/word/2024/wordml/sdtformatlock" xmlns:w16se="http://schemas.microsoft.com/office/word/2015/wordml/symex" mc:Ignorable="w14 w15 w16se w16cid w16 w16cex w16sdtdh w16sdtfl w16du">
   <w:docDefaults>
     <w:rPrDefault>
       <w:rPr>
@@ -2447,11 +2446,11 @@
     <w:name w:val="Normal"/>
     <w:qFormat/>
   </w:style>
-  <w:style w:type="paragraph" w:styleId="Heading1">
+  <w:style w:type="paragraph" w:styleId="Ttulo1">
     <w:name w:val="heading 1"/>
     <w:basedOn w:val="Normal"/>
     <w:next w:val="Normal"/>
-    <w:link w:val="Heading1Char"/>
+    <w:link w:val="Ttulo1Car"/>
     <w:uiPriority w:val="9"/>
     <w:qFormat/>
     <w:rsid w:val="006238A3"/>
@@ -2468,11 +2467,11 @@
       <w:szCs w:val="40"/>
     </w:rPr>
   </w:style>
-  <w:style w:type="paragraph" w:styleId="Heading2">
+  <w:style w:type="paragraph" w:styleId="Ttulo2">
     <w:name w:val="heading 2"/>
     <w:basedOn w:val="Normal"/>
     <w:next w:val="Normal"/>
-    <w:link w:val="Heading2Char"/>
+    <w:link w:val="Ttulo2Car"/>
     <w:uiPriority w:val="9"/>
     <w:semiHidden/>
     <w:unhideWhenUsed/>
@@ -2491,11 +2490,11 @@
       <w:szCs w:val="32"/>
     </w:rPr>
   </w:style>
-  <w:style w:type="paragraph" w:styleId="Heading3">
+  <w:style w:type="paragraph" w:styleId="Ttulo3">
     <w:name w:val="heading 3"/>
     <w:basedOn w:val="Normal"/>
     <w:next w:val="Normal"/>
-    <w:link w:val="Heading3Char"/>
+    <w:link w:val="Ttulo3Car"/>
     <w:uiPriority w:val="9"/>
     <w:semiHidden/>
     <w:unhideWhenUsed/>
@@ -2514,11 +2513,11 @@
       <w:szCs w:val="28"/>
     </w:rPr>
   </w:style>
-  <w:style w:type="paragraph" w:styleId="Heading4">
+  <w:style w:type="paragraph" w:styleId="Ttulo4">
     <w:name w:val="heading 4"/>
     <w:basedOn w:val="Normal"/>
     <w:next w:val="Normal"/>
-    <w:link w:val="Heading4Char"/>
+    <w:link w:val="Ttulo4Car"/>
     <w:uiPriority w:val="9"/>
     <w:semiHidden/>
     <w:unhideWhenUsed/>
@@ -2537,11 +2536,11 @@
       <w:color w:val="0F4761" w:themeColor="accent1" w:themeShade="BF"/>
     </w:rPr>
   </w:style>
-  <w:style w:type="paragraph" w:styleId="Heading5">
+  <w:style w:type="paragraph" w:styleId="Ttulo5">
     <w:name w:val="heading 5"/>
     <w:basedOn w:val="Normal"/>
     <w:next w:val="Normal"/>
-    <w:link w:val="Heading5Char"/>
+    <w:link w:val="Ttulo5Car"/>
     <w:uiPriority w:val="9"/>
     <w:semiHidden/>
     <w:unhideWhenUsed/>
@@ -2558,11 +2557,11 @@
       <w:color w:val="0F4761" w:themeColor="accent1" w:themeShade="BF"/>
     </w:rPr>
   </w:style>
-  <w:style w:type="paragraph" w:styleId="Heading6">
+  <w:style w:type="paragraph" w:styleId="Ttulo6">
     <w:name w:val="heading 6"/>
     <w:basedOn w:val="Normal"/>
     <w:next w:val="Normal"/>
-    <w:link w:val="Heading6Char"/>
+    <w:link w:val="Ttulo6Car"/>
     <w:uiPriority w:val="9"/>
     <w:semiHidden/>
     <w:unhideWhenUsed/>
@@ -2581,11 +2580,11 @@
       <w:color w:val="595959" w:themeColor="text1" w:themeTint="A6"/>
     </w:rPr>
   </w:style>
-  <w:style w:type="paragraph" w:styleId="Heading7">
+  <w:style w:type="paragraph" w:styleId="Ttulo7">
     <w:name w:val="heading 7"/>
     <w:basedOn w:val="Normal"/>
     <w:next w:val="Normal"/>
-    <w:link w:val="Heading7Char"/>
+    <w:link w:val="Ttulo7Car"/>
     <w:uiPriority w:val="9"/>
     <w:semiHidden/>
     <w:unhideWhenUsed/>
@@ -2602,11 +2601,11 @@
       <w:color w:val="595959" w:themeColor="text1" w:themeTint="A6"/>
     </w:rPr>
   </w:style>
-  <w:style w:type="paragraph" w:styleId="Heading8">
+  <w:style w:type="paragraph" w:styleId="Ttulo8">
     <w:name w:val="heading 8"/>
     <w:basedOn w:val="Normal"/>
     <w:next w:val="Normal"/>
-    <w:link w:val="Heading8Char"/>
+    <w:link w:val="Ttulo8Car"/>
     <w:uiPriority w:val="9"/>
     <w:semiHidden/>
     <w:unhideWhenUsed/>
@@ -2625,11 +2624,11 @@
       <w:color w:val="272727" w:themeColor="text1" w:themeTint="D8"/>
     </w:rPr>
   </w:style>
-  <w:style w:type="paragraph" w:styleId="Heading9">
+  <w:style w:type="paragraph" w:styleId="Ttulo9">
     <w:name w:val="heading 9"/>
     <w:basedOn w:val="Normal"/>
     <w:next w:val="Normal"/>
-    <w:link w:val="Heading9Char"/>
+    <w:link w:val="Ttulo9Car"/>
     <w:uiPriority w:val="9"/>
     <w:semiHidden/>
     <w:unhideWhenUsed/>
@@ -2646,13 +2645,13 @@
       <w:color w:val="272727" w:themeColor="text1" w:themeTint="D8"/>
     </w:rPr>
   </w:style>
-  <w:style w:type="character" w:default="1" w:styleId="DefaultParagraphFont">
+  <w:style w:type="character" w:default="1" w:styleId="Fuentedeprrafopredeter">
     <w:name w:val="Default Paragraph Font"/>
     <w:uiPriority w:val="1"/>
     <w:semiHidden/>
     <w:unhideWhenUsed/>
   </w:style>
-  <w:style w:type="table" w:default="1" w:styleId="TableNormal">
+  <w:style w:type="table" w:default="1" w:styleId="Tablanormal">
     <w:name w:val="Normal Table"/>
     <w:uiPriority w:val="99"/>
     <w:semiHidden/>
@@ -2667,16 +2666,16 @@
       </w:tblCellMar>
     </w:tblPr>
   </w:style>
-  <w:style w:type="numbering" w:default="1" w:styleId="NoList">
+  <w:style w:type="numbering" w:default="1" w:styleId="Sinlista">
     <w:name w:val="No List"/>
     <w:uiPriority w:val="99"/>
     <w:semiHidden/>
     <w:unhideWhenUsed/>
   </w:style>
-  <w:style w:type="character" w:customStyle="1" w:styleId="Heading1Char">
-    <w:name w:val="Heading 1 Char"/>
-    <w:basedOn w:val="DefaultParagraphFont"/>
-    <w:link w:val="Heading1"/>
+  <w:style w:type="character" w:customStyle="1" w:styleId="Ttulo1Car">
+    <w:name w:val="Título 1 Car"/>
+    <w:basedOn w:val="Fuentedeprrafopredeter"/>
+    <w:link w:val="Ttulo1"/>
     <w:uiPriority w:val="9"/>
     <w:rsid w:val="006238A3"/>
     <w:rPr>
@@ -2686,10 +2685,10 @@
       <w:szCs w:val="40"/>
     </w:rPr>
   </w:style>
-  <w:style w:type="character" w:customStyle="1" w:styleId="Heading2Char">
-    <w:name w:val="Heading 2 Char"/>
-    <w:basedOn w:val="DefaultParagraphFont"/>
-    <w:link w:val="Heading2"/>
+  <w:style w:type="character" w:customStyle="1" w:styleId="Ttulo2Car">
+    <w:name w:val="Título 2 Car"/>
+    <w:basedOn w:val="Fuentedeprrafopredeter"/>
+    <w:link w:val="Ttulo2"/>
     <w:uiPriority w:val="9"/>
     <w:semiHidden/>
     <w:rsid w:val="006238A3"/>
@@ -2700,10 +2699,10 @@
       <w:szCs w:val="32"/>
     </w:rPr>
   </w:style>
-  <w:style w:type="character" w:customStyle="1" w:styleId="Heading3Char">
-    <w:name w:val="Heading 3 Char"/>
-    <w:basedOn w:val="DefaultParagraphFont"/>
-    <w:link w:val="Heading3"/>
+  <w:style w:type="character" w:customStyle="1" w:styleId="Ttulo3Car">
+    <w:name w:val="Título 3 Car"/>
+    <w:basedOn w:val="Fuentedeprrafopredeter"/>
+    <w:link w:val="Ttulo3"/>
     <w:uiPriority w:val="9"/>
     <w:semiHidden/>
     <w:rsid w:val="006238A3"/>
@@ -2714,10 +2713,10 @@
       <w:szCs w:val="28"/>
     </w:rPr>
   </w:style>
-  <w:style w:type="character" w:customStyle="1" w:styleId="Heading4Char">
-    <w:name w:val="Heading 4 Char"/>
-    <w:basedOn w:val="DefaultParagraphFont"/>
-    <w:link w:val="Heading4"/>
+  <w:style w:type="character" w:customStyle="1" w:styleId="Ttulo4Car">
+    <w:name w:val="Título 4 Car"/>
+    <w:basedOn w:val="Fuentedeprrafopredeter"/>
+    <w:link w:val="Ttulo4"/>
     <w:uiPriority w:val="9"/>
     <w:semiHidden/>
     <w:rsid w:val="006238A3"/>
@@ -2728,10 +2727,10 @@
       <w:color w:val="0F4761" w:themeColor="accent1" w:themeShade="BF"/>
     </w:rPr>
   </w:style>
-  <w:style w:type="character" w:customStyle="1" w:styleId="Heading5Char">
-    <w:name w:val="Heading 5 Char"/>
-    <w:basedOn w:val="DefaultParagraphFont"/>
-    <w:link w:val="Heading5"/>
+  <w:style w:type="character" w:customStyle="1" w:styleId="Ttulo5Car">
+    <w:name w:val="Título 5 Car"/>
+    <w:basedOn w:val="Fuentedeprrafopredeter"/>
+    <w:link w:val="Ttulo5"/>
     <w:uiPriority w:val="9"/>
     <w:semiHidden/>
     <w:rsid w:val="006238A3"/>
@@ -2740,10 +2739,10 @@
       <w:color w:val="0F4761" w:themeColor="accent1" w:themeShade="BF"/>
     </w:rPr>
   </w:style>
-  <w:style w:type="character" w:customStyle="1" w:styleId="Heading6Char">
-    <w:name w:val="Heading 6 Char"/>
-    <w:basedOn w:val="DefaultParagraphFont"/>
-    <w:link w:val="Heading6"/>
+  <w:style w:type="character" w:customStyle="1" w:styleId="Ttulo6Car">
+    <w:name w:val="Título 6 Car"/>
+    <w:basedOn w:val="Fuentedeprrafopredeter"/>
+    <w:link w:val="Ttulo6"/>
     <w:uiPriority w:val="9"/>
     <w:semiHidden/>
     <w:rsid w:val="006238A3"/>
@@ -2754,10 +2753,10 @@
       <w:color w:val="595959" w:themeColor="text1" w:themeTint="A6"/>
     </w:rPr>
   </w:style>
-  <w:style w:type="character" w:customStyle="1" w:styleId="Heading7Char">
-    <w:name w:val="Heading 7 Char"/>
-    <w:basedOn w:val="DefaultParagraphFont"/>
-    <w:link w:val="Heading7"/>
+  <w:style w:type="character" w:customStyle="1" w:styleId="Ttulo7Car">
+    <w:name w:val="Título 7 Car"/>
+    <w:basedOn w:val="Fuentedeprrafopredeter"/>
+    <w:link w:val="Ttulo7"/>
     <w:uiPriority w:val="9"/>
     <w:semiHidden/>
     <w:rsid w:val="006238A3"/>
@@ -2766,10 +2765,10 @@
       <w:color w:val="595959" w:themeColor="text1" w:themeTint="A6"/>
     </w:rPr>
   </w:style>
-  <w:style w:type="character" w:customStyle="1" w:styleId="Heading8Char">
-    <w:name w:val="Heading 8 Char"/>
-    <w:basedOn w:val="DefaultParagraphFont"/>
-    <w:link w:val="Heading8"/>
+  <w:style w:type="character" w:customStyle="1" w:styleId="Ttulo8Car">
+    <w:name w:val="Título 8 Car"/>
+    <w:basedOn w:val="Fuentedeprrafopredeter"/>
+    <w:link w:val="Ttulo8"/>
     <w:uiPriority w:val="9"/>
     <w:semiHidden/>
     <w:rsid w:val="006238A3"/>
@@ -2780,10 +2779,10 @@
       <w:color w:val="272727" w:themeColor="text1" w:themeTint="D8"/>
     </w:rPr>
   </w:style>
-  <w:style w:type="character" w:customStyle="1" w:styleId="Heading9Char">
-    <w:name w:val="Heading 9 Char"/>
-    <w:basedOn w:val="DefaultParagraphFont"/>
-    <w:link w:val="Heading9"/>
+  <w:style w:type="character" w:customStyle="1" w:styleId="Ttulo9Car">
+    <w:name w:val="Título 9 Car"/>
+    <w:basedOn w:val="Fuentedeprrafopredeter"/>
+    <w:link w:val="Ttulo9"/>
     <w:uiPriority w:val="9"/>
     <w:semiHidden/>
     <w:rsid w:val="006238A3"/>
@@ -2792,11 +2791,11 @@
       <w:color w:val="272727" w:themeColor="text1" w:themeTint="D8"/>
     </w:rPr>
   </w:style>
-  <w:style w:type="paragraph" w:styleId="Title">
+  <w:style w:type="paragraph" w:styleId="Ttulo">
     <w:name w:val="Title"/>
     <w:basedOn w:val="Normal"/>
     <w:next w:val="Normal"/>
-    <w:link w:val="TitleChar"/>
+    <w:link w:val="TtuloCar"/>
     <w:uiPriority w:val="10"/>
     <w:qFormat/>
     <w:rsid w:val="006238A3"/>
@@ -2812,10 +2811,10 @@
       <w:szCs w:val="56"/>
     </w:rPr>
   </w:style>
-  <w:style w:type="character" w:customStyle="1" w:styleId="TitleChar">
-    <w:name w:val="Title Char"/>
-    <w:basedOn w:val="DefaultParagraphFont"/>
-    <w:link w:val="Title"/>
+  <w:style w:type="character" w:customStyle="1" w:styleId="TtuloCar">
+    <w:name w:val="Título Car"/>
+    <w:basedOn w:val="Fuentedeprrafopredeter"/>
+    <w:link w:val="Ttulo"/>
     <w:uiPriority w:val="10"/>
     <w:rsid w:val="006238A3"/>
     <w:rPr>
@@ -2826,11 +2825,11 @@
       <w:szCs w:val="56"/>
     </w:rPr>
   </w:style>
-  <w:style w:type="paragraph" w:styleId="Subtitle">
+  <w:style w:type="paragraph" w:styleId="Subttulo">
     <w:name w:val="Subtitle"/>
     <w:basedOn w:val="Normal"/>
     <w:next w:val="Normal"/>
-    <w:link w:val="SubtitleChar"/>
+    <w:link w:val="SubttuloCar"/>
     <w:uiPriority w:val="11"/>
     <w:qFormat/>
     <w:rsid w:val="006238A3"/>
@@ -2847,10 +2846,10 @@
       <w:szCs w:val="28"/>
     </w:rPr>
   </w:style>
-  <w:style w:type="character" w:customStyle="1" w:styleId="SubtitleChar">
-    <w:name w:val="Subtitle Char"/>
-    <w:basedOn w:val="DefaultParagraphFont"/>
-    <w:link w:val="Subtitle"/>
+  <w:style w:type="character" w:customStyle="1" w:styleId="SubttuloCar">
+    <w:name w:val="Subtítulo Car"/>
+    <w:basedOn w:val="Fuentedeprrafopredeter"/>
+    <w:link w:val="Subttulo"/>
     <w:uiPriority w:val="11"/>
     <w:rsid w:val="006238A3"/>
     <w:rPr>
@@ -2861,11 +2860,11 @@
       <w:szCs w:val="28"/>
     </w:rPr>
   </w:style>
-  <w:style w:type="paragraph" w:styleId="Quote">
+  <w:style w:type="paragraph" w:styleId="Cita">
     <w:name w:val="Quote"/>
     <w:basedOn w:val="Normal"/>
     <w:next w:val="Normal"/>
-    <w:link w:val="QuoteChar"/>
+    <w:link w:val="CitaCar"/>
     <w:uiPriority w:val="29"/>
     <w:qFormat/>
     <w:rsid w:val="006238A3"/>
@@ -2879,10 +2878,10 @@
       <w:color w:val="404040" w:themeColor="text1" w:themeTint="BF"/>
     </w:rPr>
   </w:style>
-  <w:style w:type="character" w:customStyle="1" w:styleId="QuoteChar">
-    <w:name w:val="Quote Char"/>
-    <w:basedOn w:val="DefaultParagraphFont"/>
-    <w:link w:val="Quote"/>
+  <w:style w:type="character" w:customStyle="1" w:styleId="CitaCar">
+    <w:name w:val="Cita Car"/>
+    <w:basedOn w:val="Fuentedeprrafopredeter"/>
+    <w:link w:val="Cita"/>
     <w:uiPriority w:val="29"/>
     <w:rsid w:val="006238A3"/>
     <w:rPr>
@@ -2891,7 +2890,7 @@
       <w:color w:val="404040" w:themeColor="text1" w:themeTint="BF"/>
     </w:rPr>
   </w:style>
-  <w:style w:type="paragraph" w:styleId="ListParagraph">
+  <w:style w:type="paragraph" w:styleId="Prrafodelista">
     <w:name w:val="List Paragraph"/>
     <w:basedOn w:val="Normal"/>
     <w:uiPriority w:val="34"/>
@@ -2902,9 +2901,9 @@
       <w:contextualSpacing/>
     </w:pPr>
   </w:style>
-  <w:style w:type="character" w:styleId="IntenseEmphasis">
+  <w:style w:type="character" w:styleId="nfasisintenso">
     <w:name w:val="Intense Emphasis"/>
-    <w:basedOn w:val="DefaultParagraphFont"/>
+    <w:basedOn w:val="Fuentedeprrafopredeter"/>
     <w:uiPriority w:val="21"/>
     <w:qFormat/>
     <w:rsid w:val="006238A3"/>
@@ -2914,11 +2913,11 @@
       <w:color w:val="0F4761" w:themeColor="accent1" w:themeShade="BF"/>
     </w:rPr>
   </w:style>
-  <w:style w:type="paragraph" w:styleId="IntenseQuote">
+  <w:style w:type="paragraph" w:styleId="Citadestacada">
     <w:name w:val="Intense Quote"/>
     <w:basedOn w:val="Normal"/>
     <w:next w:val="Normal"/>
-    <w:link w:val="IntenseQuoteChar"/>
+    <w:link w:val="CitadestacadaCar"/>
     <w:uiPriority w:val="30"/>
     <w:qFormat/>
     <w:rsid w:val="006238A3"/>
@@ -2937,10 +2936,10 @@
       <w:color w:val="0F4761" w:themeColor="accent1" w:themeShade="BF"/>
     </w:rPr>
   </w:style>
-  <w:style w:type="character" w:customStyle="1" w:styleId="IntenseQuoteChar">
-    <w:name w:val="Intense Quote Char"/>
-    <w:basedOn w:val="DefaultParagraphFont"/>
-    <w:link w:val="IntenseQuote"/>
+  <w:style w:type="character" w:customStyle="1" w:styleId="CitadestacadaCar">
+    <w:name w:val="Cita destacada Car"/>
+    <w:basedOn w:val="Fuentedeprrafopredeter"/>
+    <w:link w:val="Citadestacada"/>
     <w:uiPriority w:val="30"/>
     <w:rsid w:val="006238A3"/>
     <w:rPr>
@@ -2949,9 +2948,9 @@
       <w:color w:val="0F4761" w:themeColor="accent1" w:themeShade="BF"/>
     </w:rPr>
   </w:style>
-  <w:style w:type="character" w:styleId="IntenseReference">
+  <w:style w:type="character" w:styleId="Referenciaintensa">
     <w:name w:val="Intense Reference"/>
-    <w:basedOn w:val="DefaultParagraphFont"/>
+    <w:basedOn w:val="Fuentedeprrafopredeter"/>
     <w:uiPriority w:val="32"/>
     <w:qFormat/>
     <w:rsid w:val="006238A3"/>
@@ -2963,9 +2962,9 @@
       <w:spacing w:val="5"/>
     </w:rPr>
   </w:style>
-  <w:style w:type="table" w:styleId="TableGrid">
+  <w:style w:type="table" w:styleId="Tablaconcuadrcula">
     <w:name w:val="Table Grid"/>
-    <w:basedOn w:val="TableNormal"/>
+    <w:basedOn w:val="Tablanormal"/>
     <w:uiPriority w:val="39"/>
     <w:rsid w:val="006238A3"/>
     <w:pPr>

</xml_diff>

<commit_message>
Use the proforma template with tighter party boxes and no CONTACT rows.
Co-Authored-By: Claude Opus 5.5 <noreply@anthropic.com>
</commit_message>
<xml_diff>
--- a/src/assets/Template.docx
+++ b/src/assets/Template.docx
@@ -104,22 +104,20 @@
         <w:tblLook w:val="04A0" w:firstRow="1" w:lastRow="0" w:firstColumn="1" w:lastColumn="0" w:noHBand="0" w:noVBand="1"/>
       </w:tblPr>
       <w:tblGrid>
-        <w:gridCol w:w="1129"/>
-        <w:gridCol w:w="1133"/>
-        <w:gridCol w:w="657"/>
+        <w:gridCol w:w="2341"/>
+        <w:gridCol w:w="656"/>
         <w:gridCol w:w="140"/>
-        <w:gridCol w:w="1837"/>
-        <w:gridCol w:w="1030"/>
-        <w:gridCol w:w="1134"/>
-        <w:gridCol w:w="1138"/>
+        <w:gridCol w:w="1798"/>
+        <w:gridCol w:w="1006"/>
+        <w:gridCol w:w="2265"/>
         <w:gridCol w:w="936"/>
-        <w:gridCol w:w="2252"/>
+        <w:gridCol w:w="2244"/>
       </w:tblGrid>
       <w:tr>
         <w:tc>
           <w:tcPr>
-            <w:tcW w:w="11414" w:type="dxa"/>
-            <w:gridSpan w:val="10"/>
+            <w:tcW w:w="11386" w:type="dxa"/>
+            <w:gridSpan w:val="8"/>
             <w:tcBorders>
               <w:top w:val="single" w:sz="4" w:space="0" w:color="156082" w:themeColor="accent1"/>
               <w:bottom w:val="single" w:sz="4" w:space="0" w:color="156082" w:themeColor="accent1"/>
@@ -168,8 +166,8 @@
       <w:tr>
         <w:tc>
           <w:tcPr>
-            <w:tcW w:w="11414" w:type="dxa"/>
-            <w:gridSpan w:val="10"/>
+            <w:tcW w:w="11386" w:type="dxa"/>
+            <w:gridSpan w:val="8"/>
             <w:tcBorders>
               <w:top w:val="single" w:sz="4" w:space="0" w:color="156082" w:themeColor="accent1"/>
             </w:tcBorders>
@@ -193,8 +191,8 @@
         </w:trPr>
         <w:tc>
           <w:tcPr>
-            <w:tcW w:w="5949" w:type="dxa"/>
-            <w:gridSpan w:val="6"/>
+            <w:tcW w:w="5941" w:type="dxa"/>
+            <w:gridSpan w:val="5"/>
             <w:tcBorders>
               <w:top w:val="single" w:sz="4" w:space="0" w:color="156082" w:themeColor="accent1"/>
               <w:bottom w:val="nil"/>
@@ -234,8 +232,8 @@
         </w:tc>
         <w:tc>
           <w:tcPr>
-            <w:tcW w:w="3210" w:type="dxa"/>
-            <w:gridSpan w:val="3"/>
+            <w:tcW w:w="3201" w:type="dxa"/>
+            <w:gridSpan w:val="2"/>
             <w:tcBorders>
               <w:top w:val="single" w:sz="4" w:space="0" w:color="156082" w:themeColor="accent1"/>
               <w:bottom w:val="nil"/>
@@ -266,7 +264,7 @@
         </w:tc>
         <w:tc>
           <w:tcPr>
-            <w:tcW w:w="2255" w:type="dxa"/>
+            <w:tcW w:w="2244" w:type="dxa"/>
             <w:tcBorders>
               <w:left w:val="single" w:sz="4" w:space="0" w:color="156082" w:themeColor="accent1"/>
               <w:bottom w:val="nil"/>
@@ -298,8 +296,8 @@
       <w:tr>
         <w:tc>
           <w:tcPr>
-            <w:tcW w:w="5949" w:type="dxa"/>
-            <w:gridSpan w:val="6"/>
+            <w:tcW w:w="5941" w:type="dxa"/>
+            <w:gridSpan w:val="5"/>
             <w:vMerge w:val="restart"/>
             <w:tcBorders>
               <w:top w:val="nil"/>
@@ -318,8 +316,8 @@
         </w:tc>
         <w:tc>
           <w:tcPr>
-            <w:tcW w:w="3210" w:type="dxa"/>
-            <w:gridSpan w:val="3"/>
+            <w:tcW w:w="3201" w:type="dxa"/>
+            <w:gridSpan w:val="2"/>
             <w:tcBorders>
               <w:top w:val="nil"/>
               <w:bottom w:val="single" w:sz="4" w:space="0" w:color="156082" w:themeColor="accent1"/>
@@ -339,7 +337,7 @@
         </w:tc>
         <w:tc>
           <w:tcPr>
-            <w:tcW w:w="2255" w:type="dxa"/>
+            <w:tcW w:w="2244" w:type="dxa"/>
             <w:tcBorders>
               <w:top w:val="nil"/>
               <w:left w:val="single" w:sz="4" w:space="0" w:color="156082" w:themeColor="accent1"/>
@@ -361,8 +359,8 @@
       <w:tr>
         <w:tc>
           <w:tcPr>
-            <w:tcW w:w="5949" w:type="dxa"/>
-            <w:gridSpan w:val="6"/>
+            <w:tcW w:w="5941" w:type="dxa"/>
+            <w:gridSpan w:val="5"/>
             <w:vMerge/>
           </w:tcPr>
           <w:p>
@@ -379,8 +377,8 @@
         </w:tc>
         <w:tc>
           <w:tcPr>
-            <w:tcW w:w="5465" w:type="dxa"/>
-            <w:gridSpan w:val="4"/>
+            <w:tcW w:w="5445" w:type="dxa"/>
+            <w:gridSpan w:val="3"/>
             <w:tcBorders>
               <w:bottom w:val="nil"/>
             </w:tcBorders>
@@ -410,12 +408,12 @@
       </w:tr>
       <w:tr>
         <w:trPr>
-          <w:trHeight w:val="909"/>
+          <w:trHeight w:val="554"/>
         </w:trPr>
         <w:tc>
           <w:tcPr>
-            <w:tcW w:w="5949" w:type="dxa"/>
-            <w:gridSpan w:val="6"/>
+            <w:tcW w:w="5941" w:type="dxa"/>
+            <w:gridSpan w:val="5"/>
             <w:vMerge/>
             <w:tcBorders>
               <w:bottom w:val="single" w:sz="4" w:space="0" w:color="auto"/>
@@ -435,8 +433,8 @@
         </w:tc>
         <w:tc>
           <w:tcPr>
-            <w:tcW w:w="5465" w:type="dxa"/>
-            <w:gridSpan w:val="4"/>
+            <w:tcW w:w="5445" w:type="dxa"/>
+            <w:gridSpan w:val="3"/>
             <w:tcBorders>
               <w:top w:val="nil"/>
               <w:bottom w:val="single" w:sz="4" w:space="0" w:color="auto"/>
@@ -460,8 +458,8 @@
         </w:trPr>
         <w:tc>
           <w:tcPr>
-            <w:tcW w:w="5949" w:type="dxa"/>
-            <w:gridSpan w:val="6"/>
+            <w:tcW w:w="5941" w:type="dxa"/>
+            <w:gridSpan w:val="5"/>
             <w:vMerge w:val="restart"/>
           </w:tcPr>
           <w:p>
@@ -519,8 +517,8 @@
         </w:tc>
         <w:tc>
           <w:tcPr>
-            <w:tcW w:w="5465" w:type="dxa"/>
-            <w:gridSpan w:val="4"/>
+            <w:tcW w:w="5445" w:type="dxa"/>
+            <w:gridSpan w:val="3"/>
             <w:tcBorders>
               <w:bottom w:val="nil"/>
             </w:tcBorders>
@@ -564,8 +562,8 @@
         </w:trPr>
         <w:tc>
           <w:tcPr>
-            <w:tcW w:w="5949" w:type="dxa"/>
-            <w:gridSpan w:val="6"/>
+            <w:tcW w:w="5941" w:type="dxa"/>
+            <w:gridSpan w:val="5"/>
             <w:vMerge/>
             <w:tcBorders>
               <w:bottom w:val="nil"/>
@@ -585,8 +583,8 @@
         </w:tc>
         <w:tc>
           <w:tcPr>
-            <w:tcW w:w="5465" w:type="dxa"/>
-            <w:gridSpan w:val="4"/>
+            <w:tcW w:w="5445" w:type="dxa"/>
+            <w:gridSpan w:val="3"/>
             <w:vMerge w:val="restart"/>
             <w:tcBorders>
               <w:top w:val="nil"/>
@@ -607,12 +605,12 @@
       </w:tr>
       <w:tr>
         <w:trPr>
-          <w:trHeight w:val="1368"/>
+          <w:trHeight w:val="1042"/>
         </w:trPr>
         <w:tc>
           <w:tcPr>
-            <w:tcW w:w="5949" w:type="dxa"/>
-            <w:gridSpan w:val="6"/>
+            <w:tcW w:w="5941" w:type="dxa"/>
+            <w:gridSpan w:val="5"/>
             <w:tcBorders>
               <w:top w:val="nil"/>
               <w:bottom w:val="nil"/>
@@ -631,8 +629,8 @@
         </w:tc>
         <w:tc>
           <w:tcPr>
-            <w:tcW w:w="5465" w:type="dxa"/>
-            <w:gridSpan w:val="4"/>
+            <w:tcW w:w="5445" w:type="dxa"/>
+            <w:gridSpan w:val="3"/>
             <w:vMerge/>
             <w:tcBorders>
               <w:bottom w:val="nil"/>
@@ -648,79 +646,130 @@
                 <w:lang w:val="en-US"/>
               </w:rPr>
             </w:pPr>
+          </w:p>
+        </w:tc>
+      </w:tr>
+      <w:tr>
+        <w:tc>
+          <w:tcPr>
+            <w:tcW w:w="5941" w:type="dxa"/>
+            <w:gridSpan w:val="5"/>
+            <w:tcBorders>
+              <w:bottom w:val="nil"/>
+            </w:tcBorders>
+          </w:tcPr>
+          <w:p>
+            <w:pPr>
+              <w:rPr>
+                <w:rFonts w:ascii="Arial" w:hAnsi="Arial" w:cs="Arial"/>
+                <w:color w:val="153D63" w:themeColor="text2" w:themeTint="E6"/>
+                <w:sz w:val="18"/>
+                <w:szCs w:val="18"/>
+                <w:lang w:val="en-US"/>
+              </w:rPr>
+            </w:pPr>
+            <w:r>
+              <w:rPr>
+                <w:rFonts w:ascii="Arial" w:hAnsi="Arial" w:cs="Arial"/>
+                <w:color w:val="153D63" w:themeColor="text2" w:themeTint="E6"/>
+                <w:sz w:val="18"/>
+                <w:szCs w:val="18"/>
+                <w:lang w:val="en-US"/>
+              </w:rPr>
+              <w:t xml:space="preserve">NOTIFY PARTY / INTERMEDIATE CONSIGNEE </w:t>
+            </w:r>
+            <w:r>
+              <w:rPr>
+                <w:rFonts w:ascii="Arial" w:hAnsi="Arial" w:cs="Arial"/>
+                <w:color w:val="153D63" w:themeColor="text2" w:themeTint="E6"/>
+                <w:sz w:val="14"/>
+                <w:szCs w:val="14"/>
+                <w:lang w:val="en-US"/>
+              </w:rPr>
+              <w:t>(Name and Full Address)</w:t>
+            </w:r>
+          </w:p>
+        </w:tc>
+        <w:tc>
+          <w:tcPr>
+            <w:tcW w:w="5445" w:type="dxa"/>
+            <w:gridSpan w:val="3"/>
+            <w:tcBorders>
+              <w:bottom w:val="nil"/>
+            </w:tcBorders>
+          </w:tcPr>
+          <w:p>
+            <w:pPr>
+              <w:rPr>
+                <w:rFonts w:ascii="Arial" w:hAnsi="Arial" w:cs="Arial"/>
+                <w:color w:val="153D63" w:themeColor="text2" w:themeTint="E6"/>
+                <w:sz w:val="18"/>
+                <w:szCs w:val="18"/>
+                <w:lang w:val="en-US"/>
+              </w:rPr>
+            </w:pPr>
+            <w:r>
+              <w:rPr>
+                <w:rFonts w:ascii="Arial" w:hAnsi="Arial" w:cs="Arial"/>
+                <w:color w:val="153D63" w:themeColor="text2" w:themeTint="E6"/>
+                <w:sz w:val="14"/>
+                <w:szCs w:val="14"/>
+                <w:lang w:val="en-US"/>
+              </w:rPr>
+              <w:t>SECOND NOTIFY</w:t>
+            </w:r>
+            <w:r>
+              <w:rPr>
+                <w:rFonts w:ascii="Arial" w:hAnsi="Arial" w:cs="Arial"/>
+                <w:color w:val="153D63" w:themeColor="text2" w:themeTint="E6"/>
+                <w:sz w:val="14"/>
+                <w:szCs w:val="14"/>
+                <w:lang w:val="en-US"/>
+              </w:rPr>
+              <w:t xml:space="preserve"> (Name and Full Address)</w:t>
+            </w:r>
           </w:p>
         </w:tc>
       </w:tr>
       <w:tr>
         <w:trPr>
-          <w:trHeight w:val="107"/>
+          <w:trHeight w:val="994"/>
         </w:trPr>
         <w:tc>
           <w:tcPr>
-            <w:tcW w:w="1129" w:type="dxa"/>
+            <w:tcW w:w="5941" w:type="dxa"/>
+            <w:gridSpan w:val="5"/>
             <w:tcBorders>
               <w:top w:val="nil"/>
-              <w:bottom w:val="single" w:sz="4" w:space="0" w:color="auto"/>
-              <w:right w:val="single" w:sz="4" w:space="0" w:color="FFFFFF" w:themeColor="background1"/>
-            </w:tcBorders>
-          </w:tcPr>
-          <w:p>
-            <w:pPr>
-              <w:rPr>
-                <w:rFonts w:ascii="Arial" w:hAnsi="Arial" w:cs="Arial"/>
-                <w:sz w:val="18"/>
-                <w:szCs w:val="18"/>
-                <w:lang w:val="en-US"/>
-              </w:rPr>
-            </w:pPr>
-            <w:r>
-              <w:rPr>
-                <w:rFonts w:ascii="Arial" w:hAnsi="Arial" w:cs="Arial"/>
-                <w:color w:val="00B0F0"/>
-                <w:sz w:val="18"/>
-                <w:szCs w:val="18"/>
-                <w:u w:val="single"/>
-                <w:lang w:val="en-US"/>
-              </w:rPr>
-              <w:t>CONTACT:</w:t>
-            </w:r>
-          </w:p>
-        </w:tc>
-        <w:tc>
-          <w:tcPr>
-            <w:tcW w:w="4820" w:type="dxa"/>
-            <w:gridSpan w:val="5"/>
+              <w:bottom w:val="nil"/>
+              <w:right w:val="single" w:sz="4" w:space="0" w:color="156082" w:themeColor="accent1"/>
+            </w:tcBorders>
+          </w:tcPr>
+          <w:p>
+            <w:pPr>
+              <w:rPr>
+                <w:rFonts w:ascii="Arial" w:hAnsi="Arial" w:cs="Arial"/>
+                <w:sz w:val="18"/>
+                <w:szCs w:val="18"/>
+                <w:lang w:val="en-US"/>
+              </w:rPr>
+            </w:pPr>
+          </w:p>
+        </w:tc>
+        <w:tc>
+          <w:tcPr>
+            <w:tcW w:w="5445" w:type="dxa"/>
+            <w:gridSpan w:val="3"/>
             <w:tcBorders>
               <w:top w:val="nil"/>
-              <w:left w:val="single" w:sz="4" w:space="0" w:color="FFFFFF" w:themeColor="background1"/>
-              <w:bottom w:val="single" w:sz="4" w:space="0" w:color="auto"/>
-            </w:tcBorders>
-          </w:tcPr>
-          <w:p>
-            <w:pPr>
-              <w:rPr>
-                <w:rFonts w:ascii="Arial" w:hAnsi="Arial" w:cs="Arial"/>
-                <w:sz w:val="18"/>
-                <w:szCs w:val="18"/>
-                <w:lang w:val="en-US"/>
-              </w:rPr>
-            </w:pPr>
-          </w:p>
-        </w:tc>
-        <w:tc>
-          <w:tcPr>
-            <w:tcW w:w="5465" w:type="dxa"/>
-            <w:gridSpan w:val="4"/>
-            <w:tcBorders>
-              <w:top w:val="nil"/>
-              <w:bottom w:val="single" w:sz="4" w:space="0" w:color="auto"/>
-            </w:tcBorders>
-          </w:tcPr>
-          <w:p>
-            <w:pPr>
-              <w:rPr>
-                <w:rFonts w:ascii="Arial" w:hAnsi="Arial" w:cs="Arial"/>
-                <w:color w:val="153D63" w:themeColor="text2" w:themeTint="E6"/>
+              <w:left w:val="single" w:sz="4" w:space="0" w:color="156082" w:themeColor="accent1"/>
+              <w:bottom w:val="nil"/>
+            </w:tcBorders>
+          </w:tcPr>
+          <w:p>
+            <w:pPr>
+              <w:rPr>
+                <w:rFonts w:ascii="Arial" w:hAnsi="Arial" w:cs="Arial"/>
                 <w:sz w:val="18"/>
                 <w:szCs w:val="18"/>
                 <w:lang w:val="en-US"/>
@@ -732,8 +781,8 @@
       <w:tr>
         <w:tc>
           <w:tcPr>
-            <w:tcW w:w="5949" w:type="dxa"/>
-            <w:gridSpan w:val="6"/>
+            <w:tcW w:w="2997" w:type="dxa"/>
+            <w:gridSpan w:val="2"/>
             <w:tcBorders>
               <w:bottom w:val="nil"/>
             </w:tcBorders>
@@ -756,24 +805,14 @@
                 <w:szCs w:val="18"/>
                 <w:lang w:val="en-US"/>
               </w:rPr>
-              <w:t xml:space="preserve">NOTIFY PARTY / INTERMEDIATE CONSIGNEE </w:t>
-            </w:r>
-            <w:r>
-              <w:rPr>
-                <w:rFonts w:ascii="Arial" w:hAnsi="Arial" w:cs="Arial"/>
-                <w:color w:val="153D63" w:themeColor="text2" w:themeTint="E6"/>
-                <w:sz w:val="14"/>
-                <w:szCs w:val="14"/>
-                <w:lang w:val="en-US"/>
-              </w:rPr>
-              <w:t>(Name and Full Address)</w:t>
-            </w:r>
-          </w:p>
-        </w:tc>
-        <w:tc>
-          <w:tcPr>
-            <w:tcW w:w="5465" w:type="dxa"/>
-            <w:gridSpan w:val="4"/>
+              <w:t>INITIAL CARRIAGE BY (MODE)*</w:t>
+            </w:r>
+          </w:p>
+        </w:tc>
+        <w:tc>
+          <w:tcPr>
+            <w:tcW w:w="2944" w:type="dxa"/>
+            <w:gridSpan w:val="3"/>
             <w:tcBorders>
               <w:bottom w:val="nil"/>
             </w:tcBorders>
@@ -796,262 +835,40 @@
                 <w:szCs w:val="18"/>
                 <w:lang w:val="en-US"/>
               </w:rPr>
-              <w:t xml:space="preserve">NOTIFY PARTY / INTERMEDIATE </w:t>
-            </w:r>
-            <w:r>
-              <w:rPr>
-                <w:rFonts w:ascii="Arial" w:hAnsi="Arial" w:cs="Arial"/>
-                <w:color w:val="153D63" w:themeColor="text2" w:themeTint="E6"/>
-                <w:sz w:val="14"/>
-                <w:szCs w:val="14"/>
-                <w:lang w:val="en-US"/>
-              </w:rPr>
-              <w:t>CONSIGNEE (Name and Full Address)</w:t>
-            </w:r>
+              <w:t>PLACE OF INITIAL RECEIPT*</w:t>
+            </w:r>
+          </w:p>
+        </w:tc>
+        <w:tc>
+          <w:tcPr>
+            <w:tcW w:w="5445" w:type="dxa"/>
+            <w:gridSpan w:val="3"/>
+            <w:vMerge w:val="restart"/>
+            <w:tcBorders>
+              <w:top w:val="single" w:sz="4" w:space="0" w:color="FFFFFF" w:themeColor="background1"/>
+            </w:tcBorders>
+          </w:tcPr>
+          <w:p>
+            <w:pPr>
+              <w:rPr>
+                <w:rFonts w:ascii="Arial" w:hAnsi="Arial" w:cs="Arial"/>
+                <w:color w:val="153D63" w:themeColor="text2" w:themeTint="E6"/>
+                <w:sz w:val="18"/>
+                <w:szCs w:val="18"/>
+                <w:lang w:val="en-US"/>
+              </w:rPr>
+            </w:pPr>
           </w:p>
         </w:tc>
       </w:tr>
       <w:tr>
         <w:trPr>
-          <w:trHeight w:val="1139"/>
+          <w:trHeight w:val="58"/>
         </w:trPr>
         <w:tc>
           <w:tcPr>
-            <w:tcW w:w="5949" w:type="dxa"/>
-            <w:gridSpan w:val="6"/>
-            <w:tcBorders>
-              <w:top w:val="nil"/>
-              <w:bottom w:val="nil"/>
-              <w:right w:val="single" w:sz="4" w:space="0" w:color="156082" w:themeColor="accent1"/>
-            </w:tcBorders>
-          </w:tcPr>
-          <w:p>
-            <w:pPr>
-              <w:rPr>
-                <w:rFonts w:ascii="Arial" w:hAnsi="Arial" w:cs="Arial"/>
-                <w:sz w:val="18"/>
-                <w:szCs w:val="18"/>
-                <w:lang w:val="en-US"/>
-              </w:rPr>
-            </w:pPr>
-          </w:p>
-        </w:tc>
-        <w:tc>
-          <w:tcPr>
-            <w:tcW w:w="5465" w:type="dxa"/>
-            <w:gridSpan w:val="4"/>
-            <w:tcBorders>
-              <w:top w:val="nil"/>
-              <w:left w:val="single" w:sz="4" w:space="0" w:color="156082" w:themeColor="accent1"/>
-              <w:bottom w:val="nil"/>
-            </w:tcBorders>
-          </w:tcPr>
-          <w:p>
-            <w:pPr>
-              <w:rPr>
-                <w:rFonts w:ascii="Arial" w:hAnsi="Arial" w:cs="Arial"/>
-                <w:sz w:val="18"/>
-                <w:szCs w:val="18"/>
-                <w:lang w:val="en-US"/>
-              </w:rPr>
-            </w:pPr>
-          </w:p>
-        </w:tc>
-      </w:tr>
-      <w:tr>
-        <w:trPr>
-          <w:trHeight w:val="145"/>
-        </w:trPr>
-        <w:tc>
-          <w:tcPr>
-            <w:tcW w:w="1129" w:type="dxa"/>
-            <w:tcBorders>
-              <w:top w:val="nil"/>
-              <w:bottom w:val="single" w:sz="4" w:space="0" w:color="FFFFFF" w:themeColor="background1"/>
-              <w:right w:val="single" w:sz="4" w:space="0" w:color="FFFFFF" w:themeColor="background1"/>
-            </w:tcBorders>
-          </w:tcPr>
-          <w:p>
-            <w:pPr>
-              <w:rPr>
-                <w:rFonts w:ascii="Arial" w:hAnsi="Arial" w:cs="Arial"/>
-                <w:sz w:val="18"/>
-                <w:szCs w:val="18"/>
-                <w:lang w:val="en-US"/>
-              </w:rPr>
-            </w:pPr>
-            <w:r>
-              <w:rPr>
-                <w:rFonts w:ascii="Arial" w:hAnsi="Arial" w:cs="Arial"/>
-                <w:color w:val="00B0F0"/>
-                <w:sz w:val="18"/>
-                <w:szCs w:val="18"/>
-                <w:u w:val="single"/>
-                <w:lang w:val="en-US"/>
-              </w:rPr>
-              <w:t>CONTACT:</w:t>
-            </w:r>
-          </w:p>
-        </w:tc>
-        <w:tc>
-          <w:tcPr>
-            <w:tcW w:w="4820" w:type="dxa"/>
-            <w:gridSpan w:val="5"/>
-            <w:tcBorders>
-              <w:top w:val="nil"/>
-              <w:left w:val="single" w:sz="4" w:space="0" w:color="FFFFFF" w:themeColor="background1"/>
-            </w:tcBorders>
-          </w:tcPr>
-          <w:p>
-            <w:pPr>
-              <w:rPr>
-                <w:rFonts w:ascii="Arial" w:hAnsi="Arial" w:cs="Arial"/>
-                <w:sz w:val="18"/>
-                <w:szCs w:val="18"/>
-                <w:lang w:val="en-US"/>
-              </w:rPr>
-            </w:pPr>
-          </w:p>
-        </w:tc>
-        <w:tc>
-          <w:tcPr>
-            <w:tcW w:w="1134" w:type="dxa"/>
-            <w:tcBorders>
-              <w:top w:val="nil"/>
-              <w:right w:val="single" w:sz="4" w:space="0" w:color="FFFFFF" w:themeColor="background1"/>
-            </w:tcBorders>
-          </w:tcPr>
-          <w:p>
-            <w:pPr>
-              <w:rPr>
-                <w:rFonts w:ascii="Arial" w:hAnsi="Arial" w:cs="Arial"/>
-                <w:sz w:val="18"/>
-                <w:szCs w:val="18"/>
-                <w:lang w:val="en-US"/>
-              </w:rPr>
-            </w:pPr>
-            <w:r>
-              <w:rPr>
-                <w:rFonts w:ascii="Arial" w:hAnsi="Arial" w:cs="Arial"/>
-                <w:color w:val="00B0F0"/>
-                <w:sz w:val="18"/>
-                <w:szCs w:val="18"/>
-                <w:u w:val="single"/>
-                <w:lang w:val="en-US"/>
-              </w:rPr>
-              <w:t>CONTACT:</w:t>
-            </w:r>
-          </w:p>
-        </w:tc>
-        <w:tc>
-          <w:tcPr>
-            <w:tcW w:w="4331" w:type="dxa"/>
-            <w:gridSpan w:val="3"/>
-            <w:tcBorders>
-              <w:top w:val="nil"/>
-              <w:left w:val="single" w:sz="4" w:space="0" w:color="FFFFFF" w:themeColor="background1"/>
-            </w:tcBorders>
-          </w:tcPr>
-          <w:p>
-            <w:pPr>
-              <w:rPr>
-                <w:rFonts w:ascii="Arial" w:hAnsi="Arial" w:cs="Arial"/>
-                <w:sz w:val="18"/>
-                <w:szCs w:val="18"/>
-                <w:lang w:val="en-US"/>
-              </w:rPr>
-            </w:pPr>
-          </w:p>
-        </w:tc>
-      </w:tr>
-      <w:tr>
-        <w:tc>
-          <w:tcPr>
-            <w:tcW w:w="2921" w:type="dxa"/>
-            <w:gridSpan w:val="3"/>
-            <w:tcBorders>
-              <w:bottom w:val="nil"/>
-            </w:tcBorders>
-          </w:tcPr>
-          <w:p>
-            <w:pPr>
-              <w:rPr>
-                <w:rFonts w:ascii="Arial" w:hAnsi="Arial" w:cs="Arial"/>
-                <w:color w:val="153D63" w:themeColor="text2" w:themeTint="E6"/>
-                <w:sz w:val="18"/>
-                <w:szCs w:val="18"/>
-                <w:lang w:val="en-US"/>
-              </w:rPr>
-            </w:pPr>
-            <w:r>
-              <w:rPr>
-                <w:rFonts w:ascii="Arial" w:hAnsi="Arial" w:cs="Arial"/>
-                <w:color w:val="153D63" w:themeColor="text2" w:themeTint="E6"/>
-                <w:sz w:val="18"/>
-                <w:szCs w:val="18"/>
-                <w:lang w:val="en-US"/>
-              </w:rPr>
-              <w:t>INITIAL CARRIAGE BY (MODE)*</w:t>
-            </w:r>
-          </w:p>
-        </w:tc>
-        <w:tc>
-          <w:tcPr>
-            <w:tcW w:w="3028" w:type="dxa"/>
-            <w:gridSpan w:val="3"/>
-            <w:tcBorders>
-              <w:bottom w:val="nil"/>
-            </w:tcBorders>
-          </w:tcPr>
-          <w:p>
-            <w:pPr>
-              <w:rPr>
-                <w:rFonts w:ascii="Arial" w:hAnsi="Arial" w:cs="Arial"/>
-                <w:color w:val="153D63" w:themeColor="text2" w:themeTint="E6"/>
-                <w:sz w:val="18"/>
-                <w:szCs w:val="18"/>
-                <w:lang w:val="en-US"/>
-              </w:rPr>
-            </w:pPr>
-            <w:r>
-              <w:rPr>
-                <w:rFonts w:ascii="Arial" w:hAnsi="Arial" w:cs="Arial"/>
-                <w:color w:val="153D63" w:themeColor="text2" w:themeTint="E6"/>
-                <w:sz w:val="18"/>
-                <w:szCs w:val="18"/>
-                <w:lang w:val="en-US"/>
-              </w:rPr>
-              <w:t>PLACE OF INITIAL RECEIPT*</w:t>
-            </w:r>
-          </w:p>
-        </w:tc>
-        <w:tc>
-          <w:tcPr>
-            <w:tcW w:w="5465" w:type="dxa"/>
-            <w:gridSpan w:val="4"/>
-            <w:vMerge w:val="restart"/>
-            <w:tcBorders>
-              <w:top w:val="single" w:sz="4" w:space="0" w:color="FFFFFF" w:themeColor="background1"/>
-            </w:tcBorders>
-          </w:tcPr>
-          <w:p>
-            <w:pPr>
-              <w:rPr>
-                <w:rFonts w:ascii="Arial" w:hAnsi="Arial" w:cs="Arial"/>
-                <w:color w:val="153D63" w:themeColor="text2" w:themeTint="E6"/>
-                <w:sz w:val="18"/>
-                <w:szCs w:val="18"/>
-                <w:lang w:val="en-US"/>
-              </w:rPr>
-            </w:pPr>
-          </w:p>
-        </w:tc>
-      </w:tr>
-      <w:tr>
-        <w:tc>
-          <w:tcPr>
-            <w:tcW w:w="2921" w:type="dxa"/>
-            <w:gridSpan w:val="3"/>
+            <w:tcW w:w="2997" w:type="dxa"/>
+            <w:gridSpan w:val="2"/>
             <w:tcBorders>
               <w:top w:val="nil"/>
               <w:bottom w:val="single" w:sz="4" w:space="0" w:color="auto"/>
@@ -1070,7 +887,7 @@
         </w:tc>
         <w:tc>
           <w:tcPr>
-            <w:tcW w:w="3028" w:type="dxa"/>
+            <w:tcW w:w="2944" w:type="dxa"/>
             <w:gridSpan w:val="3"/>
             <w:tcBorders>
               <w:top w:val="nil"/>
@@ -1090,8 +907,8 @@
         </w:tc>
         <w:tc>
           <w:tcPr>
-            <w:tcW w:w="5465" w:type="dxa"/>
-            <w:gridSpan w:val="4"/>
+            <w:tcW w:w="5445" w:type="dxa"/>
+            <w:gridSpan w:val="3"/>
             <w:vMerge/>
           </w:tcPr>
           <w:p>
@@ -1113,8 +930,8 @@
         </w:trPr>
         <w:tc>
           <w:tcPr>
-            <w:tcW w:w="2921" w:type="dxa"/>
-            <w:gridSpan w:val="3"/>
+            <w:tcW w:w="2997" w:type="dxa"/>
+            <w:gridSpan w:val="2"/>
             <w:tcBorders>
               <w:bottom w:val="nil"/>
             </w:tcBorders>
@@ -1163,7 +980,7 @@
         </w:tc>
         <w:tc>
           <w:tcPr>
-            <w:tcW w:w="3028" w:type="dxa"/>
+            <w:tcW w:w="2944" w:type="dxa"/>
             <w:gridSpan w:val="3"/>
             <w:tcBorders>
               <w:bottom w:val="nil"/>
@@ -1193,8 +1010,7 @@
         </w:tc>
         <w:tc>
           <w:tcPr>
-            <w:tcW w:w="2274" w:type="dxa"/>
-            <w:gridSpan w:val="2"/>
+            <w:tcW w:w="2265" w:type="dxa"/>
             <w:tcBorders>
               <w:bottom w:val="nil"/>
             </w:tcBorders>
@@ -1223,7 +1039,7 @@
         </w:tc>
         <w:tc>
           <w:tcPr>
-            <w:tcW w:w="3191" w:type="dxa"/>
+            <w:tcW w:w="3180" w:type="dxa"/>
             <w:gridSpan w:val="2"/>
             <w:tcBorders>
               <w:bottom w:val="nil"/>
@@ -1255,8 +1071,8 @@
       <w:tr>
         <w:tc>
           <w:tcPr>
-            <w:tcW w:w="2921" w:type="dxa"/>
-            <w:gridSpan w:val="3"/>
+            <w:tcW w:w="2997" w:type="dxa"/>
+            <w:gridSpan w:val="2"/>
             <w:tcBorders>
               <w:top w:val="nil"/>
               <w:bottom w:val="single" w:sz="4" w:space="0" w:color="auto"/>
@@ -1275,7 +1091,7 @@
         </w:tc>
         <w:tc>
           <w:tcPr>
-            <w:tcW w:w="3028" w:type="dxa"/>
+            <w:tcW w:w="2944" w:type="dxa"/>
             <w:gridSpan w:val="3"/>
             <w:tcBorders>
               <w:top w:val="nil"/>
@@ -1295,8 +1111,7 @@
         </w:tc>
         <w:tc>
           <w:tcPr>
-            <w:tcW w:w="2274" w:type="dxa"/>
-            <w:gridSpan w:val="2"/>
+            <w:tcW w:w="2265" w:type="dxa"/>
             <w:tcBorders>
               <w:top w:val="nil"/>
               <w:bottom w:val="single" w:sz="4" w:space="0" w:color="auto"/>
@@ -1315,7 +1130,7 @@
         </w:tc>
         <w:tc>
           <w:tcPr>
-            <w:tcW w:w="3191" w:type="dxa"/>
+            <w:tcW w:w="3180" w:type="dxa"/>
             <w:gridSpan w:val="2"/>
             <w:tcBorders>
               <w:top w:val="nil"/>
@@ -1337,8 +1152,8 @@
       <w:tr>
         <w:tc>
           <w:tcPr>
-            <w:tcW w:w="2921" w:type="dxa"/>
-            <w:gridSpan w:val="3"/>
+            <w:tcW w:w="2997" w:type="dxa"/>
+            <w:gridSpan w:val="2"/>
             <w:tcBorders>
               <w:bottom w:val="nil"/>
             </w:tcBorders>
@@ -1367,7 +1182,7 @@
         </w:tc>
         <w:tc>
           <w:tcPr>
-            <w:tcW w:w="3028" w:type="dxa"/>
+            <w:tcW w:w="2944" w:type="dxa"/>
             <w:gridSpan w:val="3"/>
             <w:tcBorders>
               <w:bottom w:val="nil"/>
@@ -1397,8 +1212,8 @@
         </w:tc>
         <w:tc>
           <w:tcPr>
-            <w:tcW w:w="5465" w:type="dxa"/>
-            <w:gridSpan w:val="4"/>
+            <w:tcW w:w="5445" w:type="dxa"/>
+            <w:gridSpan w:val="3"/>
             <w:tcBorders>
               <w:bottom w:val="nil"/>
             </w:tcBorders>
@@ -1429,8 +1244,8 @@
       <w:tr>
         <w:tc>
           <w:tcPr>
-            <w:tcW w:w="2921" w:type="dxa"/>
-            <w:gridSpan w:val="3"/>
+            <w:tcW w:w="2997" w:type="dxa"/>
+            <w:gridSpan w:val="2"/>
             <w:tcBorders>
               <w:top w:val="nil"/>
             </w:tcBorders>
@@ -1448,7 +1263,7 @@
         </w:tc>
         <w:tc>
           <w:tcPr>
-            <w:tcW w:w="3028" w:type="dxa"/>
+            <w:tcW w:w="2944" w:type="dxa"/>
             <w:gridSpan w:val="3"/>
             <w:tcBorders>
               <w:top w:val="nil"/>
@@ -1467,8 +1282,8 @@
         </w:tc>
         <w:tc>
           <w:tcPr>
-            <w:tcW w:w="5465" w:type="dxa"/>
-            <w:gridSpan w:val="4"/>
+            <w:tcW w:w="5445" w:type="dxa"/>
+            <w:gridSpan w:val="3"/>
             <w:tcBorders>
               <w:top w:val="nil"/>
             </w:tcBorders>
@@ -1488,8 +1303,8 @@
       <w:tr>
         <w:tc>
           <w:tcPr>
-            <w:tcW w:w="11414" w:type="dxa"/>
-            <w:gridSpan w:val="10"/>
+            <w:tcW w:w="11386" w:type="dxa"/>
+            <w:gridSpan w:val="8"/>
           </w:tcPr>
           <w:p>
             <w:pPr>
@@ -1525,8 +1340,7 @@
         </w:trPr>
         <w:tc>
           <w:tcPr>
-            <w:tcW w:w="2264" w:type="dxa"/>
-            <w:gridSpan w:val="2"/>
+            <w:tcW w:w="2341" w:type="dxa"/>
           </w:tcPr>
           <w:p>
             <w:pPr>
@@ -1552,7 +1366,7 @@
         </w:tc>
         <w:tc>
           <w:tcPr>
-            <w:tcW w:w="797" w:type="dxa"/>
+            <w:tcW w:w="796" w:type="dxa"/>
             <w:gridSpan w:val="2"/>
           </w:tcPr>
           <w:p>
@@ -1579,8 +1393,8 @@
         </w:tc>
         <w:tc>
           <w:tcPr>
-            <w:tcW w:w="5162" w:type="dxa"/>
-            <w:gridSpan w:val="4"/>
+            <w:tcW w:w="5069" w:type="dxa"/>
+            <w:gridSpan w:val="3"/>
           </w:tcPr>
           <w:p>
             <w:pPr>
@@ -1630,7 +1444,7 @@
         </w:tc>
         <w:tc>
           <w:tcPr>
-            <w:tcW w:w="2255" w:type="dxa"/>
+            <w:tcW w:w="2244" w:type="dxa"/>
           </w:tcPr>
           <w:p>
             <w:pPr>
@@ -1661,7 +1475,22 @@
         </w:trPr>
         <w:tc>
           <w:tcPr>
-            <w:tcW w:w="2264" w:type="dxa"/>
+            <w:tcW w:w="2341" w:type="dxa"/>
+          </w:tcPr>
+          <w:p>
+            <w:pPr>
+              <w:rPr>
+                <w:rFonts w:ascii="Arial" w:hAnsi="Arial" w:cs="Arial"/>
+                <w:sz w:val="18"/>
+                <w:szCs w:val="18"/>
+                <w:lang w:val="en-US"/>
+              </w:rPr>
+            </w:pPr>
+          </w:p>
+        </w:tc>
+        <w:tc>
+          <w:tcPr>
+            <w:tcW w:w="796" w:type="dxa"/>
             <w:gridSpan w:val="2"/>
           </w:tcPr>
           <w:p>
@@ -1677,24 +1506,8 @@
         </w:tc>
         <w:tc>
           <w:tcPr>
-            <w:tcW w:w="797" w:type="dxa"/>
-            <w:gridSpan w:val="2"/>
-          </w:tcPr>
-          <w:p>
-            <w:pPr>
-              <w:rPr>
-                <w:rFonts w:ascii="Arial" w:hAnsi="Arial" w:cs="Arial"/>
-                <w:sz w:val="18"/>
-                <w:szCs w:val="18"/>
-                <w:lang w:val="en-US"/>
-              </w:rPr>
-            </w:pPr>
-          </w:p>
-        </w:tc>
-        <w:tc>
-          <w:tcPr>
-            <w:tcW w:w="5162" w:type="dxa"/>
-            <w:gridSpan w:val="4"/>
+            <w:tcW w:w="5069" w:type="dxa"/>
+            <w:gridSpan w:val="3"/>
           </w:tcPr>
           <w:p>
             <w:pPr>
@@ -1724,7 +1537,7 @@
         </w:tc>
         <w:tc>
           <w:tcPr>
-            <w:tcW w:w="2255" w:type="dxa"/>
+            <w:tcW w:w="2244" w:type="dxa"/>
           </w:tcPr>
           <w:p>
             <w:pPr>
@@ -1741,8 +1554,7 @@
       <w:tr>
         <w:tc>
           <w:tcPr>
-            <w:tcW w:w="2264" w:type="dxa"/>
-            <w:gridSpan w:val="2"/>
+            <w:tcW w:w="2341" w:type="dxa"/>
           </w:tcPr>
           <w:p>
             <w:pPr>
@@ -1768,7 +1580,7 @@
         </w:tc>
         <w:tc>
           <w:tcPr>
-            <w:tcW w:w="2647" w:type="dxa"/>
+            <w:tcW w:w="2594" w:type="dxa"/>
             <w:gridSpan w:val="3"/>
           </w:tcPr>
           <w:p>
@@ -1795,8 +1607,8 @@
         </w:tc>
         <w:tc>
           <w:tcPr>
-            <w:tcW w:w="6503" w:type="dxa"/>
-            <w:gridSpan w:val="5"/>
+            <w:tcW w:w="6451" w:type="dxa"/>
+            <w:gridSpan w:val="4"/>
             <w:vMerge w:val="restart"/>
           </w:tcPr>
           <w:p>
@@ -1828,8 +1640,7 @@
         </w:trPr>
         <w:tc>
           <w:tcPr>
-            <w:tcW w:w="2264" w:type="dxa"/>
-            <w:gridSpan w:val="2"/>
+            <w:tcW w:w="2341" w:type="dxa"/>
             <w:vMerge w:val="restart"/>
           </w:tcPr>
           <w:p>
@@ -1856,7 +1667,7 @@
         </w:tc>
         <w:tc>
           <w:tcPr>
-            <w:tcW w:w="2647" w:type="dxa"/>
+            <w:tcW w:w="2594" w:type="dxa"/>
             <w:gridSpan w:val="3"/>
             <w:vMerge w:val="restart"/>
             <w:tcBorders>
@@ -1877,8 +1688,8 @@
         </w:tc>
         <w:tc>
           <w:tcPr>
-            <w:tcW w:w="6503" w:type="dxa"/>
-            <w:gridSpan w:val="5"/>
+            <w:tcW w:w="6451" w:type="dxa"/>
+            <w:gridSpan w:val="4"/>
             <w:vMerge/>
             <w:tcBorders>
               <w:bottom w:val="single" w:sz="4" w:space="0" w:color="auto"/>
@@ -1903,8 +1714,7 @@
         </w:trPr>
         <w:tc>
           <w:tcPr>
-            <w:tcW w:w="2264" w:type="dxa"/>
-            <w:gridSpan w:val="2"/>
+            <w:tcW w:w="2341" w:type="dxa"/>
             <w:vMerge/>
           </w:tcPr>
           <w:p>
@@ -1921,7 +1731,7 @@
         </w:tc>
         <w:tc>
           <w:tcPr>
-            <w:tcW w:w="2647" w:type="dxa"/>
+            <w:tcW w:w="2594" w:type="dxa"/>
             <w:gridSpan w:val="3"/>
             <w:vMerge/>
           </w:tcPr>
@@ -1939,8 +1749,8 @@
         </w:tc>
         <w:tc>
           <w:tcPr>
-            <w:tcW w:w="6503" w:type="dxa"/>
-            <w:gridSpan w:val="5"/>
+            <w:tcW w:w="6451" w:type="dxa"/>
+            <w:gridSpan w:val="4"/>
           </w:tcPr>
           <w:p>
             <w:pPr>
@@ -1960,8 +1770,7 @@
         </w:trPr>
         <w:tc>
           <w:tcPr>
-            <w:tcW w:w="2264" w:type="dxa"/>
-            <w:gridSpan w:val="2"/>
+            <w:tcW w:w="2341" w:type="dxa"/>
             <w:vMerge/>
           </w:tcPr>
           <w:p>
@@ -1978,7 +1787,7 @@
         </w:tc>
         <w:tc>
           <w:tcPr>
-            <w:tcW w:w="2647" w:type="dxa"/>
+            <w:tcW w:w="2594" w:type="dxa"/>
             <w:gridSpan w:val="3"/>
             <w:vMerge/>
           </w:tcPr>
@@ -1996,8 +1805,8 @@
         </w:tc>
         <w:tc>
           <w:tcPr>
-            <w:tcW w:w="6503" w:type="dxa"/>
-            <w:gridSpan w:val="5"/>
+            <w:tcW w:w="6451" w:type="dxa"/>
+            <w:gridSpan w:val="4"/>
           </w:tcPr>
           <w:p>
             <w:pPr>
@@ -2648,7 +2457,6 @@
   <w:style w:type="character" w:default="1" w:styleId="Fuentedeprrafopredeter">
     <w:name w:val="Default Paragraph Font"/>
     <w:uiPriority w:val="1"/>
-    <w:semiHidden/>
     <w:unhideWhenUsed/>
   </w:style>
   <w:style w:type="table" w:default="1" w:styleId="Tablanormal">

</xml_diff>

<commit_message>
Match the HBL font sizes in the proforma and show the CBM total as "CBM: 120".
Co-Authored-By: Claude Opus 5.5 <noreply@anthropic.com>
</commit_message>
<xml_diff>
--- a/src/assets/Template.docx
+++ b/src/assets/Template.docx
@@ -7,8 +7,8 @@
         <w:rPr>
           <w:rFonts w:ascii="Arial" w:hAnsi="Arial" w:cs="Arial"/>
           <w:color w:val="153D63" w:themeColor="text2" w:themeTint="E6"/>
-          <w:sz w:val="18"/>
-          <w:szCs w:val="18"/>
+          <w:sz w:val="17"/>
+          <w:szCs w:val="17"/>
           <w:lang w:val="en-US"/>
         </w:rPr>
       </w:pPr>
@@ -17,8 +17,8 @@
           <w:rFonts w:ascii="Arial" w:hAnsi="Arial" w:cs="Arial"/>
           <w:noProof/>
           <w:color w:val="153D63" w:themeColor="text2" w:themeTint="E6"/>
-          <w:sz w:val="18"/>
-          <w:szCs w:val="18"/>
+          <w:sz w:val="17"/>
+          <w:szCs w:val="17"/>
           <w:lang w:val="en-US"/>
         </w:rPr>
         <w:drawing>
@@ -91,8 +91,8 @@
         <w:rPr>
           <w:rFonts w:ascii="Arial" w:hAnsi="Arial" w:cs="Arial"/>
           <w:color w:val="153D63" w:themeColor="text2" w:themeTint="E6"/>
-          <w:sz w:val="18"/>
-          <w:szCs w:val="18"/>
+          <w:sz w:val="17"/>
+          <w:szCs w:val="17"/>
           <w:lang w:val="en-US"/>
         </w:rPr>
       </w:pPr>
@@ -133,17 +133,17 @@
                 <w:b/>
                 <w:bCs/>
                 <w:color w:val="153D63" w:themeColor="text2" w:themeTint="E6"/>
-                <w:sz w:val="18"/>
-                <w:szCs w:val="18"/>
-                <w:lang w:val="en-US"/>
-              </w:rPr>
-            </w:pPr>
-            <w:r>
-              <w:rPr>
-                <w:rFonts w:ascii="Arial" w:hAnsi="Arial" w:cs="Arial"/>
-                <w:color w:val="153D63" w:themeColor="text2" w:themeTint="E6"/>
-                <w:sz w:val="18"/>
-                <w:szCs w:val="18"/>
+                <w:sz w:val="17"/>
+                <w:szCs w:val="17"/>
+                <w:lang w:val="en-US"/>
+              </w:rPr>
+            </w:pPr>
+            <w:r>
+              <w:rPr>
+                <w:rFonts w:ascii="Arial" w:hAnsi="Arial" w:cs="Arial"/>
+                <w:color w:val="153D63" w:themeColor="text2" w:themeTint="E6"/>
+                <w:sz w:val="17"/>
+                <w:szCs w:val="17"/>
                 <w:lang w:val="en-US"/>
               </w:rPr>
               <w:tab/>
@@ -154,8 +154,8 @@
                 <w:b/>
                 <w:bCs/>
                 <w:color w:val="153D63" w:themeColor="text2" w:themeTint="E6"/>
-                <w:sz w:val="18"/>
-                <w:szCs w:val="18"/>
+                <w:sz w:val="21"/>
+                <w:szCs w:val="21"/>
                 <w:lang w:val="en-US"/>
               </w:rPr>
               <w:t>PROFORMA</w:t>
@@ -177,8 +177,8 @@
               <w:rPr>
                 <w:rFonts w:ascii="Arial" w:hAnsi="Arial" w:cs="Arial"/>
                 <w:color w:val="153D63" w:themeColor="text2" w:themeTint="E6"/>
-                <w:sz w:val="18"/>
-                <w:szCs w:val="18"/>
+                <w:sz w:val="17"/>
+                <w:szCs w:val="17"/>
                 <w:lang w:val="en-US"/>
               </w:rPr>
             </w:pPr>
@@ -203,17 +203,17 @@
               <w:rPr>
                 <w:rFonts w:ascii="Arial" w:hAnsi="Arial" w:cs="Arial"/>
                 <w:color w:val="153D63" w:themeColor="text2" w:themeTint="E6"/>
-                <w:sz w:val="18"/>
-                <w:szCs w:val="18"/>
-                <w:lang w:val="en-US"/>
-              </w:rPr>
-            </w:pPr>
-            <w:r>
-              <w:rPr>
-                <w:rFonts w:ascii="Arial" w:hAnsi="Arial" w:cs="Arial"/>
-                <w:color w:val="153D63" w:themeColor="text2" w:themeTint="E6"/>
-                <w:sz w:val="18"/>
-                <w:szCs w:val="18"/>
+                <w:sz w:val="17"/>
+                <w:szCs w:val="17"/>
+                <w:lang w:val="en-US"/>
+              </w:rPr>
+            </w:pPr>
+            <w:r>
+              <w:rPr>
+                <w:rFonts w:ascii="Arial" w:hAnsi="Arial" w:cs="Arial"/>
+                <w:color w:val="153D63" w:themeColor="text2" w:themeTint="E6"/>
+                <w:sz w:val="17"/>
+                <w:szCs w:val="17"/>
                 <w:lang w:val="en-US"/>
               </w:rPr>
               <w:t xml:space="preserve">SHIPPER/EXPORT </w:t>
@@ -245,12 +245,33 @@
               <w:rPr>
                 <w:rFonts w:ascii="Arial" w:hAnsi="Arial" w:cs="Arial"/>
                 <w:color w:val="153D63" w:themeColor="text2" w:themeTint="E6"/>
-                <w:sz w:val="18"/>
-                <w:szCs w:val="18"/>
-                <w:lang w:val="en-US"/>
-              </w:rPr>
-            </w:pPr>
-            <w:r>
+                <w:sz w:val="17"/>
+                <w:szCs w:val="17"/>
+                <w:lang w:val="en-US"/>
+              </w:rPr>
+            </w:pPr>
+            <w:r>
+              <w:rPr>
+                <w:rFonts w:ascii="Arial" w:hAnsi="Arial" w:cs="Arial"/>
+                <w:color w:val="153D63" w:themeColor="text2" w:themeTint="E6"/>
+                <w:sz w:val="17"/>
+                <w:szCs w:val="17"/>
+                <w:lang w:val="en-US"/>
+              </w:rPr>
+              <w:t>BOOKING NUMBER</w:t>
+            </w:r>
+          </w:p>
+        </w:tc>
+        <w:tc>
+          <w:tcPr>
+            <w:tcW w:w="2244" w:type="dxa"/>
+            <w:tcBorders>
+              <w:left w:val="single" w:sz="4" w:space="0" w:color="156082" w:themeColor="accent1"/>
+              <w:bottom w:val="nil"/>
+            </w:tcBorders>
+          </w:tcPr>
+          <w:p>
+            <w:pPr>
               <w:rPr>
                 <w:rFonts w:ascii="Arial" w:hAnsi="Arial" w:cs="Arial"/>
                 <w:color w:val="153D63" w:themeColor="text2" w:themeTint="E6"/>
@@ -258,34 +279,13 @@
                 <w:szCs w:val="14"/>
                 <w:lang w:val="en-US"/>
               </w:rPr>
-              <w:t>BOOKING NUMBER</w:t>
-            </w:r>
-          </w:p>
-        </w:tc>
-        <w:tc>
-          <w:tcPr>
-            <w:tcW w:w="2244" w:type="dxa"/>
-            <w:tcBorders>
-              <w:left w:val="single" w:sz="4" w:space="0" w:color="156082" w:themeColor="accent1"/>
-              <w:bottom w:val="nil"/>
-            </w:tcBorders>
-          </w:tcPr>
-          <w:p>
-            <w:pPr>
-              <w:rPr>
-                <w:rFonts w:ascii="Arial" w:hAnsi="Arial" w:cs="Arial"/>
-                <w:color w:val="153D63" w:themeColor="text2" w:themeTint="E6"/>
-                <w:sz w:val="14"/>
-                <w:szCs w:val="14"/>
-                <w:lang w:val="en-US"/>
-              </w:rPr>
-            </w:pPr>
-            <w:r>
-              <w:rPr>
-                <w:rFonts w:ascii="Arial" w:hAnsi="Arial" w:cs="Arial"/>
-                <w:color w:val="153D63" w:themeColor="text2" w:themeTint="E6"/>
-                <w:sz w:val="14"/>
-                <w:szCs w:val="14"/>
+            </w:pPr>
+            <w:r>
+              <w:rPr>
+                <w:rFonts w:ascii="Arial" w:hAnsi="Arial" w:cs="Arial"/>
+                <w:color w:val="153D63" w:themeColor="text2" w:themeTint="E6"/>
+                <w:sz w:val="17"/>
+                <w:szCs w:val="17"/>
                 <w:lang w:val="en-US"/>
               </w:rPr>
               <w:t>BILL OF LADING NO.</w:t>
@@ -307,8 +307,8 @@
             <w:pPr>
               <w:rPr>
                 <w:rFonts w:ascii="Arial" w:hAnsi="Arial" w:cs="Arial"/>
-                <w:sz w:val="18"/>
-                <w:szCs w:val="18"/>
+                <w:sz w:val="17"/>
+                <w:szCs w:val="17"/>
                 <w:lang w:val="en-US"/>
               </w:rPr>
             </w:pPr>
@@ -328,8 +328,8 @@
             <w:pPr>
               <w:rPr>
                 <w:rFonts w:ascii="Arial" w:hAnsi="Arial" w:cs="Arial"/>
-                <w:sz w:val="18"/>
-                <w:szCs w:val="18"/>
+                <w:sz w:val="17"/>
+                <w:szCs w:val="17"/>
                 <w:lang w:val="en-US"/>
               </w:rPr>
             </w:pPr>
@@ -348,8 +348,8 @@
             <w:pPr>
               <w:rPr>
                 <w:rFonts w:ascii="Arial" w:hAnsi="Arial" w:cs="Arial"/>
-                <w:sz w:val="18"/>
-                <w:szCs w:val="18"/>
+                <w:sz w:val="17"/>
+                <w:szCs w:val="17"/>
                 <w:lang w:val="en-US"/>
               </w:rPr>
             </w:pPr>
@@ -368,8 +368,8 @@
               <w:rPr>
                 <w:rFonts w:ascii="Arial" w:hAnsi="Arial" w:cs="Arial"/>
                 <w:color w:val="153D63" w:themeColor="text2" w:themeTint="E6"/>
-                <w:sz w:val="18"/>
-                <w:szCs w:val="18"/>
+                <w:sz w:val="17"/>
+                <w:szCs w:val="17"/>
                 <w:lang w:val="en-US"/>
               </w:rPr>
             </w:pPr>
@@ -388,17 +388,17 @@
               <w:rPr>
                 <w:rFonts w:ascii="Arial" w:hAnsi="Arial" w:cs="Arial"/>
                 <w:color w:val="153D63" w:themeColor="text2" w:themeTint="E6"/>
-                <w:sz w:val="18"/>
-                <w:szCs w:val="18"/>
-                <w:lang w:val="en-US"/>
-              </w:rPr>
-            </w:pPr>
-            <w:r>
-              <w:rPr>
-                <w:rFonts w:ascii="Arial" w:hAnsi="Arial" w:cs="Arial"/>
-                <w:color w:val="153D63" w:themeColor="text2" w:themeTint="E6"/>
-                <w:sz w:val="18"/>
-                <w:szCs w:val="18"/>
+                <w:sz w:val="17"/>
+                <w:szCs w:val="17"/>
+                <w:lang w:val="en-US"/>
+              </w:rPr>
+            </w:pPr>
+            <w:r>
+              <w:rPr>
+                <w:rFonts w:ascii="Arial" w:hAnsi="Arial" w:cs="Arial"/>
+                <w:color w:val="153D63" w:themeColor="text2" w:themeTint="E6"/>
+                <w:sz w:val="17"/>
+                <w:szCs w:val="17"/>
                 <w:lang w:val="en-US"/>
               </w:rPr>
               <w:t>EXPORT REFERENCES</w:t>
@@ -424,8 +424,8 @@
               <w:rPr>
                 <w:rFonts w:ascii="Arial" w:hAnsi="Arial" w:cs="Arial"/>
                 <w:color w:val="153D63" w:themeColor="text2" w:themeTint="E6"/>
-                <w:sz w:val="18"/>
-                <w:szCs w:val="18"/>
+                <w:sz w:val="17"/>
+                <w:szCs w:val="17"/>
                 <w:lang w:val="en-US"/>
               </w:rPr>
             </w:pPr>
@@ -444,8 +444,8 @@
             <w:pPr>
               <w:rPr>
                 <w:rFonts w:ascii="Arial" w:hAnsi="Arial" w:cs="Arial"/>
-                <w:sz w:val="18"/>
-                <w:szCs w:val="18"/>
+                <w:sz w:val="17"/>
+                <w:szCs w:val="17"/>
                 <w:lang w:val="en-US"/>
               </w:rPr>
             </w:pPr>
@@ -467,17 +467,17 @@
               <w:rPr>
                 <w:rFonts w:ascii="Arial" w:hAnsi="Arial" w:cs="Arial"/>
                 <w:color w:val="153D63" w:themeColor="text2" w:themeTint="E6"/>
-                <w:sz w:val="18"/>
-                <w:szCs w:val="18"/>
-                <w:lang w:val="en-US"/>
-              </w:rPr>
-            </w:pPr>
-            <w:r>
-              <w:rPr>
-                <w:rFonts w:ascii="Arial" w:hAnsi="Arial" w:cs="Arial"/>
-                <w:color w:val="153D63" w:themeColor="text2" w:themeTint="E6"/>
-                <w:sz w:val="18"/>
-                <w:szCs w:val="18"/>
+                <w:sz w:val="17"/>
+                <w:szCs w:val="17"/>
+                <w:lang w:val="en-US"/>
+              </w:rPr>
+            </w:pPr>
+            <w:r>
+              <w:rPr>
+                <w:rFonts w:ascii="Arial" w:hAnsi="Arial" w:cs="Arial"/>
+                <w:color w:val="153D63" w:themeColor="text2" w:themeTint="E6"/>
+                <w:sz w:val="17"/>
+                <w:szCs w:val="17"/>
                 <w:lang w:val="en-US"/>
               </w:rPr>
               <w:t xml:space="preserve">CONSIGNEE </w:t>
@@ -498,8 +498,8 @@
               <w:rPr>
                 <w:rFonts w:ascii="Arial" w:hAnsi="Arial" w:cs="Arial"/>
                 <w:color w:val="153D63" w:themeColor="text2" w:themeTint="E6"/>
-                <w:sz w:val="18"/>
-                <w:szCs w:val="18"/>
+                <w:sz w:val="17"/>
+                <w:szCs w:val="17"/>
                 <w:lang w:val="en-US"/>
               </w:rPr>
             </w:pPr>
@@ -528,17 +528,17 @@
               <w:rPr>
                 <w:rFonts w:ascii="Arial" w:hAnsi="Arial" w:cs="Arial"/>
                 <w:color w:val="153D63" w:themeColor="text2" w:themeTint="E6"/>
-                <w:sz w:val="18"/>
-                <w:szCs w:val="18"/>
-                <w:lang w:val="en-US"/>
-              </w:rPr>
-            </w:pPr>
-            <w:r>
-              <w:rPr>
-                <w:rFonts w:ascii="Arial" w:hAnsi="Arial" w:cs="Arial"/>
-                <w:color w:val="153D63" w:themeColor="text2" w:themeTint="E6"/>
-                <w:sz w:val="18"/>
-                <w:szCs w:val="18"/>
+                <w:sz w:val="17"/>
+                <w:szCs w:val="17"/>
+                <w:lang w:val="en-US"/>
+              </w:rPr>
+            </w:pPr>
+            <w:r>
+              <w:rPr>
+                <w:rFonts w:ascii="Arial" w:hAnsi="Arial" w:cs="Arial"/>
+                <w:color w:val="153D63" w:themeColor="text2" w:themeTint="E6"/>
+                <w:sz w:val="17"/>
+                <w:szCs w:val="17"/>
                 <w:lang w:val="en-US"/>
               </w:rPr>
               <w:t xml:space="preserve">FORWARD AGENT </w:t>
@@ -574,8 +574,8 @@
               <w:rPr>
                 <w:rFonts w:ascii="Arial" w:hAnsi="Arial" w:cs="Arial"/>
                 <w:color w:val="153D63" w:themeColor="text2" w:themeTint="E6"/>
-                <w:sz w:val="18"/>
-                <w:szCs w:val="18"/>
+                <w:sz w:val="17"/>
+                <w:szCs w:val="17"/>
                 <w:lang w:val="en-US"/>
               </w:rPr>
             </w:pPr>
@@ -595,8 +595,8 @@
             <w:pPr>
               <w:rPr>
                 <w:rFonts w:ascii="Arial" w:hAnsi="Arial" w:cs="Arial"/>
-                <w:sz w:val="18"/>
-                <w:szCs w:val="18"/>
+                <w:sz w:val="17"/>
+                <w:szCs w:val="17"/>
                 <w:lang w:val="en-US"/>
               </w:rPr>
             </w:pPr>
@@ -620,8 +620,8 @@
             <w:pPr>
               <w:rPr>
                 <w:rFonts w:ascii="Arial" w:hAnsi="Arial" w:cs="Arial"/>
-                <w:sz w:val="18"/>
-                <w:szCs w:val="18"/>
+                <w:sz w:val="17"/>
+                <w:szCs w:val="17"/>
                 <w:lang w:val="en-US"/>
               </w:rPr>
             </w:pPr>
@@ -641,8 +641,8 @@
               <w:rPr>
                 <w:rFonts w:ascii="Arial" w:hAnsi="Arial" w:cs="Arial"/>
                 <w:color w:val="153D63" w:themeColor="text2" w:themeTint="E6"/>
-                <w:sz w:val="18"/>
-                <w:szCs w:val="18"/>
+                <w:sz w:val="17"/>
+                <w:szCs w:val="17"/>
                 <w:lang w:val="en-US"/>
               </w:rPr>
             </w:pPr>
@@ -663,17 +663,17 @@
               <w:rPr>
                 <w:rFonts w:ascii="Arial" w:hAnsi="Arial" w:cs="Arial"/>
                 <w:color w:val="153D63" w:themeColor="text2" w:themeTint="E6"/>
-                <w:sz w:val="18"/>
-                <w:szCs w:val="18"/>
-                <w:lang w:val="en-US"/>
-              </w:rPr>
-            </w:pPr>
-            <w:r>
-              <w:rPr>
-                <w:rFonts w:ascii="Arial" w:hAnsi="Arial" w:cs="Arial"/>
-                <w:color w:val="153D63" w:themeColor="text2" w:themeTint="E6"/>
-                <w:sz w:val="18"/>
-                <w:szCs w:val="18"/>
+                <w:sz w:val="17"/>
+                <w:szCs w:val="17"/>
+                <w:lang w:val="en-US"/>
+              </w:rPr>
+            </w:pPr>
+            <w:r>
+              <w:rPr>
+                <w:rFonts w:ascii="Arial" w:hAnsi="Arial" w:cs="Arial"/>
+                <w:color w:val="153D63" w:themeColor="text2" w:themeTint="E6"/>
+                <w:sz w:val="17"/>
+                <w:szCs w:val="17"/>
                 <w:lang w:val="en-US"/>
               </w:rPr>
               <w:t xml:space="preserve">NOTIFY PARTY / INTERMEDIATE CONSIGNEE </w:t>
@@ -703,17 +703,17 @@
               <w:rPr>
                 <w:rFonts w:ascii="Arial" w:hAnsi="Arial" w:cs="Arial"/>
                 <w:color w:val="153D63" w:themeColor="text2" w:themeTint="E6"/>
-                <w:sz w:val="18"/>
-                <w:szCs w:val="18"/>
-                <w:lang w:val="en-US"/>
-              </w:rPr>
-            </w:pPr>
-            <w:r>
-              <w:rPr>
-                <w:rFonts w:ascii="Arial" w:hAnsi="Arial" w:cs="Arial"/>
-                <w:color w:val="153D63" w:themeColor="text2" w:themeTint="E6"/>
-                <w:sz w:val="14"/>
-                <w:szCs w:val="14"/>
+                <w:sz w:val="17"/>
+                <w:szCs w:val="17"/>
+                <w:lang w:val="en-US"/>
+              </w:rPr>
+            </w:pPr>
+            <w:r>
+              <w:rPr>
+                <w:rFonts w:ascii="Arial" w:hAnsi="Arial" w:cs="Arial"/>
+                <w:color w:val="153D63" w:themeColor="text2" w:themeTint="E6"/>
+                <w:sz w:val="17"/>
+                <w:szCs w:val="17"/>
                 <w:lang w:val="en-US"/>
               </w:rPr>
               <w:t>SECOND NOTIFY</w:t>
@@ -749,8 +749,8 @@
             <w:pPr>
               <w:rPr>
                 <w:rFonts w:ascii="Arial" w:hAnsi="Arial" w:cs="Arial"/>
-                <w:sz w:val="18"/>
-                <w:szCs w:val="18"/>
+                <w:sz w:val="17"/>
+                <w:szCs w:val="17"/>
                 <w:lang w:val="en-US"/>
               </w:rPr>
             </w:pPr>
@@ -770,8 +770,8 @@
             <w:pPr>
               <w:rPr>
                 <w:rFonts w:ascii="Arial" w:hAnsi="Arial" w:cs="Arial"/>
-                <w:sz w:val="18"/>
-                <w:szCs w:val="18"/>
+                <w:sz w:val="17"/>
+                <w:szCs w:val="17"/>
                 <w:lang w:val="en-US"/>
               </w:rPr>
             </w:pPr>
@@ -792,17 +792,17 @@
               <w:rPr>
                 <w:rFonts w:ascii="Arial" w:hAnsi="Arial" w:cs="Arial"/>
                 <w:color w:val="153D63" w:themeColor="text2" w:themeTint="E6"/>
-                <w:sz w:val="18"/>
-                <w:szCs w:val="18"/>
-                <w:lang w:val="en-US"/>
-              </w:rPr>
-            </w:pPr>
-            <w:r>
-              <w:rPr>
-                <w:rFonts w:ascii="Arial" w:hAnsi="Arial" w:cs="Arial"/>
-                <w:color w:val="153D63" w:themeColor="text2" w:themeTint="E6"/>
-                <w:sz w:val="18"/>
-                <w:szCs w:val="18"/>
+                <w:sz w:val="17"/>
+                <w:szCs w:val="17"/>
+                <w:lang w:val="en-US"/>
+              </w:rPr>
+            </w:pPr>
+            <w:r>
+              <w:rPr>
+                <w:rFonts w:ascii="Arial" w:hAnsi="Arial" w:cs="Arial"/>
+                <w:color w:val="153D63" w:themeColor="text2" w:themeTint="E6"/>
+                <w:sz w:val="17"/>
+                <w:szCs w:val="17"/>
                 <w:lang w:val="en-US"/>
               </w:rPr>
               <w:t>INITIAL CARRIAGE BY (MODE)*</w:t>
@@ -822,17 +822,17 @@
               <w:rPr>
                 <w:rFonts w:ascii="Arial" w:hAnsi="Arial" w:cs="Arial"/>
                 <w:color w:val="153D63" w:themeColor="text2" w:themeTint="E6"/>
-                <w:sz w:val="18"/>
-                <w:szCs w:val="18"/>
-                <w:lang w:val="en-US"/>
-              </w:rPr>
-            </w:pPr>
-            <w:r>
-              <w:rPr>
-                <w:rFonts w:ascii="Arial" w:hAnsi="Arial" w:cs="Arial"/>
-                <w:color w:val="153D63" w:themeColor="text2" w:themeTint="E6"/>
-                <w:sz w:val="18"/>
-                <w:szCs w:val="18"/>
+                <w:sz w:val="17"/>
+                <w:szCs w:val="17"/>
+                <w:lang w:val="en-US"/>
+              </w:rPr>
+            </w:pPr>
+            <w:r>
+              <w:rPr>
+                <w:rFonts w:ascii="Arial" w:hAnsi="Arial" w:cs="Arial"/>
+                <w:color w:val="153D63" w:themeColor="text2" w:themeTint="E6"/>
+                <w:sz w:val="17"/>
+                <w:szCs w:val="17"/>
                 <w:lang w:val="en-US"/>
               </w:rPr>
               <w:t>PLACE OF INITIAL RECEIPT*</w:t>
@@ -853,8 +853,8 @@
               <w:rPr>
                 <w:rFonts w:ascii="Arial" w:hAnsi="Arial" w:cs="Arial"/>
                 <w:color w:val="153D63" w:themeColor="text2" w:themeTint="E6"/>
-                <w:sz w:val="18"/>
-                <w:szCs w:val="18"/>
+                <w:sz w:val="17"/>
+                <w:szCs w:val="17"/>
                 <w:lang w:val="en-US"/>
               </w:rPr>
             </w:pPr>
@@ -878,8 +878,8 @@
             <w:pPr>
               <w:rPr>
                 <w:rFonts w:ascii="Arial" w:hAnsi="Arial" w:cs="Arial"/>
-                <w:sz w:val="18"/>
-                <w:szCs w:val="18"/>
+                <w:sz w:val="17"/>
+                <w:szCs w:val="17"/>
                 <w:lang w:val="en-US"/>
               </w:rPr>
             </w:pPr>
@@ -898,8 +898,8 @@
             <w:pPr>
               <w:rPr>
                 <w:rFonts w:ascii="Arial" w:hAnsi="Arial" w:cs="Arial"/>
-                <w:sz w:val="18"/>
-                <w:szCs w:val="18"/>
+                <w:sz w:val="17"/>
+                <w:szCs w:val="17"/>
                 <w:lang w:val="en-US"/>
               </w:rPr>
             </w:pPr>
@@ -916,8 +916,8 @@
               <w:rPr>
                 <w:rFonts w:ascii="Arial" w:hAnsi="Arial" w:cs="Arial"/>
                 <w:color w:val="153D63" w:themeColor="text2" w:themeTint="E6"/>
-                <w:sz w:val="18"/>
-                <w:szCs w:val="18"/>
+                <w:sz w:val="17"/>
+                <w:szCs w:val="17"/>
                 <w:lang w:val="en-US"/>
               </w:rPr>
             </w:pPr>
@@ -1314,8 +1314,8 @@
                 <w:b/>
                 <w:bCs/>
                 <w:color w:val="153D63" w:themeColor="text2" w:themeTint="E6"/>
-                <w:sz w:val="18"/>
-                <w:szCs w:val="18"/>
+                <w:sz w:val="17"/>
+                <w:szCs w:val="17"/>
                 <w:lang w:val="en-US"/>
               </w:rPr>
             </w:pPr>
@@ -1325,8 +1325,8 @@
                 <w:b/>
                 <w:bCs/>
                 <w:color w:val="153D63" w:themeColor="text2" w:themeTint="E6"/>
-                <w:sz w:val="18"/>
-                <w:szCs w:val="18"/>
+                <w:sz w:val="17"/>
+                <w:szCs w:val="17"/>
                 <w:lang w:val="en-US"/>
               </w:rPr>
               <w:t>PARTICULARS FURNISHED BY SHIPPER</w:t>
@@ -1347,8 +1347,8 @@
               <w:rPr>
                 <w:rFonts w:ascii="Arial" w:hAnsi="Arial" w:cs="Arial"/>
                 <w:color w:val="153D63" w:themeColor="text2" w:themeTint="E6"/>
-                <w:sz w:val="18"/>
-                <w:szCs w:val="18"/>
+                <w:sz w:val="17"/>
+                <w:szCs w:val="17"/>
                 <w:lang w:val="en-US"/>
               </w:rPr>
             </w:pPr>
@@ -1374,8 +1374,8 @@
               <w:rPr>
                 <w:rFonts w:ascii="Arial" w:hAnsi="Arial" w:cs="Arial"/>
                 <w:color w:val="153D63" w:themeColor="text2" w:themeTint="E6"/>
-                <w:sz w:val="18"/>
-                <w:szCs w:val="18"/>
+                <w:sz w:val="17"/>
+                <w:szCs w:val="17"/>
                 <w:lang w:val="en-US"/>
               </w:rPr>
             </w:pPr>
@@ -1400,16 +1400,16 @@
             <w:pPr>
               <w:rPr>
                 <w:color w:val="0A2F41" w:themeColor="accent1" w:themeShade="80"/>
-                <w:sz w:val="18"/>
-                <w:szCs w:val="18"/>
+                <w:sz w:val="17"/>
+                <w:szCs w:val="17"/>
                 <w:lang w:val="en-US"/>
               </w:rPr>
             </w:pPr>
             <w:r>
               <w:rPr>
                 <w:color w:val="0A2F41" w:themeColor="accent1" w:themeShade="80"/>
-                <w:sz w:val="18"/>
-                <w:szCs w:val="18"/>
+                <w:sz w:val="17"/>
+                <w:szCs w:val="17"/>
                 <w:lang w:val="en-US"/>
               </w:rPr>
               <w:t>DESCRIPTION OF PACKAGES AND GOODS</w:t>
@@ -1425,17 +1425,17 @@
               <w:rPr>
                 <w:rFonts w:ascii="Arial" w:hAnsi="Arial" w:cs="Arial"/>
                 <w:color w:val="153D63" w:themeColor="text2" w:themeTint="E6"/>
-                <w:sz w:val="18"/>
-                <w:szCs w:val="18"/>
-                <w:lang w:val="en-US"/>
-              </w:rPr>
-            </w:pPr>
-            <w:r>
-              <w:rPr>
-                <w:rFonts w:ascii="Arial" w:hAnsi="Arial" w:cs="Arial"/>
-                <w:color w:val="153D63" w:themeColor="text2" w:themeTint="E6"/>
-                <w:sz w:val="18"/>
-                <w:szCs w:val="18"/>
+                <w:sz w:val="17"/>
+                <w:szCs w:val="17"/>
+                <w:lang w:val="en-US"/>
+              </w:rPr>
+            </w:pPr>
+            <w:r>
+              <w:rPr>
+                <w:rFonts w:ascii="Arial" w:hAnsi="Arial" w:cs="Arial"/>
+                <w:color w:val="153D63" w:themeColor="text2" w:themeTint="E6"/>
+                <w:sz w:val="17"/>
+                <w:szCs w:val="17"/>
                 <w:lang w:val="en-US"/>
               </w:rPr>
               <w:t>GROSS WEIGHT</w:t>
@@ -1451,17 +1451,17 @@
               <w:rPr>
                 <w:rFonts w:ascii="Arial" w:hAnsi="Arial" w:cs="Arial"/>
                 <w:color w:val="153D63" w:themeColor="text2" w:themeTint="E6"/>
-                <w:sz w:val="18"/>
-                <w:szCs w:val="18"/>
-                <w:lang w:val="en-US"/>
-              </w:rPr>
-            </w:pPr>
-            <w:r>
-              <w:rPr>
-                <w:rFonts w:ascii="Arial" w:hAnsi="Arial" w:cs="Arial"/>
-                <w:color w:val="153D63" w:themeColor="text2" w:themeTint="E6"/>
-                <w:sz w:val="18"/>
-                <w:szCs w:val="18"/>
+                <w:sz w:val="17"/>
+                <w:szCs w:val="17"/>
+                <w:lang w:val="en-US"/>
+              </w:rPr>
+            </w:pPr>
+            <w:r>
+              <w:rPr>
+                <w:rFonts w:ascii="Arial" w:hAnsi="Arial" w:cs="Arial"/>
+                <w:color w:val="153D63" w:themeColor="text2" w:themeTint="E6"/>
+                <w:sz w:val="17"/>
+                <w:szCs w:val="17"/>
                 <w:lang w:val="en-US"/>
               </w:rPr>
               <w:t>MEASUREMENT</w:t>
@@ -1481,8 +1481,8 @@
             <w:pPr>
               <w:rPr>
                 <w:rFonts w:ascii="Arial" w:hAnsi="Arial" w:cs="Arial"/>
-                <w:sz w:val="18"/>
-                <w:szCs w:val="18"/>
+                <w:sz w:val="17"/>
+                <w:szCs w:val="17"/>
                 <w:lang w:val="en-US"/>
               </w:rPr>
             </w:pPr>
@@ -1497,8 +1497,8 @@
             <w:pPr>
               <w:rPr>
                 <w:rFonts w:ascii="Arial" w:hAnsi="Arial" w:cs="Arial"/>
-                <w:sz w:val="18"/>
-                <w:szCs w:val="18"/>
+                <w:sz w:val="17"/>
+                <w:szCs w:val="17"/>
                 <w:lang w:val="en-US"/>
               </w:rPr>
             </w:pPr>
@@ -1513,8 +1513,8 @@
             <w:pPr>
               <w:rPr>
                 <w:rFonts w:ascii="Arial" w:hAnsi="Arial" w:cs="Arial"/>
-                <w:sz w:val="18"/>
-                <w:szCs w:val="18"/>
+                <w:sz w:val="17"/>
+                <w:szCs w:val="17"/>
                 <w:lang w:val="en-US"/>
               </w:rPr>
             </w:pPr>
@@ -1528,8 +1528,8 @@
             <w:pPr>
               <w:rPr>
                 <w:rFonts w:ascii="Arial" w:hAnsi="Arial" w:cs="Arial"/>
-                <w:sz w:val="18"/>
-                <w:szCs w:val="18"/>
+                <w:sz w:val="17"/>
+                <w:szCs w:val="17"/>
                 <w:lang w:val="en-US"/>
               </w:rPr>
             </w:pPr>
@@ -1543,8 +1543,8 @@
             <w:pPr>
               <w:rPr>
                 <w:rFonts w:ascii="Arial" w:hAnsi="Arial" w:cs="Arial"/>
-                <w:sz w:val="18"/>
-                <w:szCs w:val="18"/>
+                <w:sz w:val="17"/>
+                <w:szCs w:val="17"/>
                 <w:lang w:val="en-US"/>
               </w:rPr>
             </w:pPr>
@@ -1561,8 +1561,8 @@
               <w:rPr>
                 <w:rFonts w:ascii="Arial" w:hAnsi="Arial" w:cs="Arial"/>
                 <w:color w:val="153D63" w:themeColor="text2" w:themeTint="E6"/>
-                <w:sz w:val="18"/>
-                <w:szCs w:val="18"/>
+                <w:sz w:val="17"/>
+                <w:szCs w:val="17"/>
                 <w:lang w:val="en-US"/>
               </w:rPr>
             </w:pPr>
@@ -1588,8 +1588,8 @@
               <w:rPr>
                 <w:rFonts w:ascii="Arial" w:hAnsi="Arial" w:cs="Arial"/>
                 <w:color w:val="153D63" w:themeColor="text2" w:themeTint="E6"/>
-                <w:sz w:val="18"/>
-                <w:szCs w:val="18"/>
+                <w:sz w:val="17"/>
+                <w:szCs w:val="17"/>
                 <w:lang w:val="en-US"/>
               </w:rPr>
             </w:pPr>
@@ -1616,8 +1616,8 @@
               <w:rPr>
                 <w:rFonts w:ascii="Arial" w:hAnsi="Arial" w:cs="Arial"/>
                 <w:color w:val="153D63" w:themeColor="text2" w:themeTint="E6"/>
-                <w:sz w:val="18"/>
-                <w:szCs w:val="18"/>
+                <w:sz w:val="17"/>
+                <w:szCs w:val="17"/>
                 <w:lang w:val="en-US"/>
               </w:rPr>
             </w:pPr>
@@ -1648,8 +1648,8 @@
               <w:rPr>
                 <w:rFonts w:ascii="Arial" w:hAnsi="Arial" w:cs="Arial"/>
                 <w:color w:val="153D63" w:themeColor="text2" w:themeTint="E6"/>
-                <w:sz w:val="18"/>
-                <w:szCs w:val="18"/>
+                <w:sz w:val="17"/>
+                <w:szCs w:val="17"/>
                 <w:lang w:val="en-US"/>
               </w:rPr>
             </w:pPr>
@@ -1679,8 +1679,8 @@
               <w:rPr>
                 <w:rFonts w:ascii="Arial" w:hAnsi="Arial" w:cs="Arial"/>
                 <w:color w:val="153D63" w:themeColor="text2" w:themeTint="E6"/>
-                <w:sz w:val="18"/>
-                <w:szCs w:val="18"/>
+                <w:sz w:val="17"/>
+                <w:szCs w:val="17"/>
                 <w:lang w:val="en-US"/>
               </w:rPr>
             </w:pPr>
@@ -1700,8 +1700,8 @@
               <w:rPr>
                 <w:rFonts w:ascii="Arial" w:hAnsi="Arial" w:cs="Arial"/>
                 <w:color w:val="153D63" w:themeColor="text2" w:themeTint="E6"/>
-                <w:sz w:val="18"/>
-                <w:szCs w:val="18"/>
+                <w:sz w:val="17"/>
+                <w:szCs w:val="17"/>
                 <w:lang w:val="en-US"/>
               </w:rPr>
             </w:pPr>
@@ -1722,8 +1722,8 @@
               <w:rPr>
                 <w:rFonts w:ascii="Arial" w:hAnsi="Arial" w:cs="Arial"/>
                 <w:color w:val="153D63" w:themeColor="text2" w:themeTint="E6"/>
-                <w:sz w:val="18"/>
-                <w:szCs w:val="18"/>
+                <w:sz w:val="17"/>
+                <w:szCs w:val="17"/>
                 <w:lang w:val="en-US"/>
               </w:rPr>
             </w:pPr>
@@ -1740,8 +1740,8 @@
               <w:rPr>
                 <w:rFonts w:ascii="Arial" w:hAnsi="Arial" w:cs="Arial"/>
                 <w:color w:val="153D63" w:themeColor="text2" w:themeTint="E6"/>
-                <w:sz w:val="18"/>
-                <w:szCs w:val="18"/>
+                <w:sz w:val="17"/>
+                <w:szCs w:val="17"/>
                 <w:lang w:val="en-US"/>
               </w:rPr>
             </w:pPr>
@@ -1756,8 +1756,8 @@
             <w:pPr>
               <w:rPr>
                 <w:rFonts w:ascii="Arial" w:hAnsi="Arial" w:cs="Arial"/>
-                <w:sz w:val="18"/>
-                <w:szCs w:val="18"/>
+                <w:sz w:val="17"/>
+                <w:szCs w:val="17"/>
                 <w:lang w:val="en-US"/>
               </w:rPr>
             </w:pPr>
@@ -1778,8 +1778,8 @@
               <w:rPr>
                 <w:rFonts w:ascii="Arial" w:hAnsi="Arial" w:cs="Arial"/>
                 <w:color w:val="153D63" w:themeColor="text2" w:themeTint="E6"/>
-                <w:sz w:val="18"/>
-                <w:szCs w:val="18"/>
+                <w:sz w:val="17"/>
+                <w:szCs w:val="17"/>
                 <w:lang w:val="en-US"/>
               </w:rPr>
             </w:pPr>
@@ -1796,8 +1796,8 @@
               <w:rPr>
                 <w:rFonts w:ascii="Arial" w:hAnsi="Arial" w:cs="Arial"/>
                 <w:color w:val="153D63" w:themeColor="text2" w:themeTint="E6"/>
-                <w:sz w:val="18"/>
-                <w:szCs w:val="18"/>
+                <w:sz w:val="17"/>
+                <w:szCs w:val="17"/>
                 <w:lang w:val="en-US"/>
               </w:rPr>
             </w:pPr>
@@ -1838,8 +1838,8 @@
         <w:rPr>
           <w:rFonts w:ascii="Arial" w:hAnsi="Arial" w:cs="Arial"/>
           <w:color w:val="153D63" w:themeColor="text2" w:themeTint="E6"/>
-          <w:sz w:val="18"/>
-          <w:szCs w:val="18"/>
+          <w:sz w:val="17"/>
+          <w:szCs w:val="17"/>
           <w:lang w:val="en-US"/>
         </w:rPr>
       </w:pPr>

</xml_diff>